<commit_message>
Lab 01. Version 01.
</commit_message>
<xml_diff>
--- a/docs/initial/RequirementsMyDrinkShop_1.0.docx
+++ b/docs/initial/RequirementsMyDrinkShop_1.0.docx
@@ -17,18 +17,18 @@
           <w:rFonts w:cstheme="minorHAnsi"/>
           <w:b/>
           <w:bCs/>
-        </w:rPr>
-      </w:pPr>
-      <w:proofErr w:type="spellStart"/>
+          <w:lang w:val="ro-RO"/>
+        </w:rPr>
+      </w:pPr>
       <w:r>
         <w:rPr>
           <w:rFonts w:cstheme="minorHAnsi"/>
           <w:b/>
           <w:bCs/>
+          <w:lang w:val="ro-RO"/>
         </w:rPr>
         <w:t>MyDrinkShop</w:t>
       </w:r>
-      <w:proofErr w:type="spellEnd"/>
     </w:p>
     <w:p>
       <w:pPr>
@@ -41,319 +41,15 @@
         <w:jc w:val="both"/>
         <w:rPr>
           <w:rFonts w:cstheme="minorHAnsi"/>
-        </w:rPr>
-      </w:pPr>
-      <w:r>
-        <w:rPr>
-          <w:rFonts w:cstheme="minorHAnsi"/>
-        </w:rPr>
-        <w:t xml:space="preserve">Se cere </w:t>
-      </w:r>
-      <w:proofErr w:type="spellStart"/>
-      <w:r>
-        <w:rPr>
-          <w:rFonts w:cstheme="minorHAnsi"/>
-        </w:rPr>
-        <w:t>realizarea</w:t>
-      </w:r>
-      <w:proofErr w:type="spellEnd"/>
-      <w:r>
-        <w:rPr>
-          <w:rFonts w:cstheme="minorHAnsi"/>
-        </w:rPr>
-        <w:t xml:space="preserve"> </w:t>
-      </w:r>
-      <w:proofErr w:type="spellStart"/>
-      <w:r>
-        <w:rPr>
-          <w:rFonts w:cstheme="minorHAnsi"/>
-        </w:rPr>
-        <w:t>unei</w:t>
-      </w:r>
-      <w:proofErr w:type="spellEnd"/>
-      <w:r>
-        <w:rPr>
-          <w:rFonts w:cstheme="minorHAnsi"/>
-        </w:rPr>
-        <w:t xml:space="preserve"> </w:t>
-      </w:r>
-      <w:proofErr w:type="spellStart"/>
-      <w:r>
-        <w:rPr>
-          <w:rFonts w:cstheme="minorHAnsi"/>
-        </w:rPr>
-        <w:t>aplicații</w:t>
-      </w:r>
-      <w:proofErr w:type="spellEnd"/>
-      <w:r>
-        <w:rPr>
-          <w:rFonts w:cstheme="minorHAnsi"/>
-        </w:rPr>
-        <w:t xml:space="preserve"> software </w:t>
-      </w:r>
-      <w:proofErr w:type="spellStart"/>
-      <w:r>
-        <w:rPr>
-          <w:rFonts w:cstheme="minorHAnsi"/>
-        </w:rPr>
-        <w:t>pentru</w:t>
-      </w:r>
-      <w:proofErr w:type="spellEnd"/>
-      <w:r>
-        <w:rPr>
-          <w:rFonts w:cstheme="minorHAnsi"/>
-        </w:rPr>
-        <w:t xml:space="preserve"> </w:t>
-      </w:r>
-      <w:proofErr w:type="spellStart"/>
-      <w:r>
-        <w:rPr>
-          <w:rFonts w:cstheme="minorHAnsi"/>
-        </w:rPr>
-        <w:t>gestionarea</w:t>
-      </w:r>
-      <w:proofErr w:type="spellEnd"/>
-      <w:r>
-        <w:rPr>
-          <w:rFonts w:cstheme="minorHAnsi"/>
-        </w:rPr>
-        <w:t xml:space="preserve"> </w:t>
-      </w:r>
-      <w:proofErr w:type="spellStart"/>
-      <w:r>
-        <w:rPr>
-          <w:rFonts w:cstheme="minorHAnsi"/>
-        </w:rPr>
-        <w:t>activității</w:t>
-      </w:r>
-      <w:proofErr w:type="spellEnd"/>
-      <w:r>
-        <w:rPr>
-          <w:rFonts w:cstheme="minorHAnsi"/>
-        </w:rPr>
-        <w:t xml:space="preserve"> </w:t>
-      </w:r>
-      <w:proofErr w:type="spellStart"/>
-      <w:r>
-        <w:rPr>
-          <w:rFonts w:cstheme="minorHAnsi"/>
-        </w:rPr>
-        <w:t>unui</w:t>
-      </w:r>
-      <w:proofErr w:type="spellEnd"/>
-      <w:r>
-        <w:rPr>
-          <w:rFonts w:cstheme="minorHAnsi"/>
-        </w:rPr>
-        <w:t xml:space="preserve"> </w:t>
-      </w:r>
-      <w:r>
-        <w:rPr>
-          <w:rFonts w:cstheme="minorHAnsi"/>
-        </w:rPr>
-        <w:t>drinks</w:t>
-      </w:r>
-      <w:r>
-        <w:rPr>
-          <w:rFonts w:cstheme="minorHAnsi"/>
-        </w:rPr>
-        <w:t xml:space="preserve"> shop, care </w:t>
-      </w:r>
-      <w:proofErr w:type="spellStart"/>
-      <w:r>
-        <w:rPr>
-          <w:rFonts w:cstheme="minorHAnsi"/>
-        </w:rPr>
-        <w:t>să</w:t>
-      </w:r>
-      <w:proofErr w:type="spellEnd"/>
-      <w:r>
-        <w:rPr>
-          <w:rFonts w:cstheme="minorHAnsi"/>
-        </w:rPr>
-        <w:t xml:space="preserve"> </w:t>
-      </w:r>
-      <w:proofErr w:type="spellStart"/>
-      <w:r>
-        <w:rPr>
-          <w:rFonts w:cstheme="minorHAnsi"/>
-        </w:rPr>
-        <w:t>permită</w:t>
-      </w:r>
-      <w:proofErr w:type="spellEnd"/>
-      <w:r>
-        <w:rPr>
-          <w:rFonts w:cstheme="minorHAnsi"/>
-        </w:rPr>
-        <w:t xml:space="preserve"> </w:t>
-      </w:r>
-      <w:proofErr w:type="spellStart"/>
-      <w:r>
-        <w:rPr>
-          <w:rFonts w:cstheme="minorHAnsi"/>
-        </w:rPr>
-        <w:t>administrarea</w:t>
-      </w:r>
-      <w:proofErr w:type="spellEnd"/>
-      <w:r>
-        <w:rPr>
-          <w:rFonts w:cstheme="minorHAnsi"/>
-        </w:rPr>
-        <w:t xml:space="preserve"> </w:t>
-      </w:r>
-      <w:proofErr w:type="spellStart"/>
-      <w:r>
-        <w:rPr>
-          <w:rFonts w:cstheme="minorHAnsi"/>
-        </w:rPr>
-        <w:t>produselor</w:t>
-      </w:r>
-      <w:proofErr w:type="spellEnd"/>
-      <w:r>
-        <w:rPr>
-          <w:rFonts w:cstheme="minorHAnsi"/>
-        </w:rPr>
-        <w:t xml:space="preserve"> </w:t>
-      </w:r>
-      <w:proofErr w:type="spellStart"/>
-      <w:r>
-        <w:rPr>
-          <w:rFonts w:cstheme="minorHAnsi"/>
-        </w:rPr>
-        <w:t>vândute</w:t>
-      </w:r>
-      <w:proofErr w:type="spellEnd"/>
-      <w:r>
-        <w:rPr>
-          <w:rFonts w:cstheme="minorHAnsi"/>
-        </w:rPr>
-        <w:t xml:space="preserve"> (</w:t>
-      </w:r>
-      <w:proofErr w:type="spellStart"/>
-      <w:r>
-        <w:rPr>
-          <w:rFonts w:cstheme="minorHAnsi"/>
-        </w:rPr>
-        <w:t>băuturi</w:t>
-      </w:r>
-      <w:proofErr w:type="spellEnd"/>
-      <w:r>
-        <w:rPr>
-          <w:rFonts w:cstheme="minorHAnsi"/>
-        </w:rPr>
-        <w:t xml:space="preserve">), a </w:t>
-      </w:r>
-      <w:proofErr w:type="spellStart"/>
-      <w:r>
-        <w:rPr>
-          <w:rFonts w:cstheme="minorHAnsi"/>
-        </w:rPr>
-        <w:t>ingredientelor</w:t>
-      </w:r>
-      <w:proofErr w:type="spellEnd"/>
-      <w:r>
-        <w:rPr>
-          <w:rFonts w:cstheme="minorHAnsi"/>
-        </w:rPr>
-        <w:t xml:space="preserve"> </w:t>
-      </w:r>
-      <w:proofErr w:type="spellStart"/>
-      <w:r>
-        <w:rPr>
-          <w:rFonts w:cstheme="minorHAnsi"/>
-        </w:rPr>
-        <w:t>utilizate</w:t>
-      </w:r>
-      <w:proofErr w:type="spellEnd"/>
-      <w:r>
-        <w:rPr>
-          <w:rFonts w:cstheme="minorHAnsi"/>
-        </w:rPr>
-        <w:t xml:space="preserve">, a </w:t>
-      </w:r>
-      <w:proofErr w:type="spellStart"/>
-      <w:r>
-        <w:rPr>
-          <w:rFonts w:cstheme="minorHAnsi"/>
-        </w:rPr>
-        <w:t>rețetelor</w:t>
-      </w:r>
-      <w:proofErr w:type="spellEnd"/>
-      <w:r>
-        <w:rPr>
-          <w:rFonts w:cstheme="minorHAnsi"/>
-        </w:rPr>
-        <w:t xml:space="preserve"> de </w:t>
-      </w:r>
-      <w:proofErr w:type="spellStart"/>
-      <w:r>
-        <w:rPr>
-          <w:rFonts w:cstheme="minorHAnsi"/>
-        </w:rPr>
-        <w:t>preparare</w:t>
-      </w:r>
-      <w:proofErr w:type="spellEnd"/>
-      <w:r>
-        <w:rPr>
-          <w:rFonts w:cstheme="minorHAnsi"/>
-        </w:rPr>
-        <w:t xml:space="preserve"> </w:t>
-      </w:r>
-      <w:proofErr w:type="spellStart"/>
-      <w:r>
-        <w:rPr>
-          <w:rFonts w:cstheme="minorHAnsi"/>
-        </w:rPr>
-        <w:t>și</w:t>
-      </w:r>
-      <w:proofErr w:type="spellEnd"/>
-      <w:r>
-        <w:rPr>
-          <w:rFonts w:cstheme="minorHAnsi"/>
-        </w:rPr>
-        <w:t xml:space="preserve"> a </w:t>
-      </w:r>
-      <w:proofErr w:type="spellStart"/>
-      <w:r>
-        <w:rPr>
-          <w:rFonts w:cstheme="minorHAnsi"/>
-        </w:rPr>
-        <w:t>comenzilor</w:t>
-      </w:r>
-      <w:proofErr w:type="spellEnd"/>
-      <w:r>
-        <w:rPr>
-          <w:rFonts w:cstheme="minorHAnsi"/>
-        </w:rPr>
-        <w:t xml:space="preserve"> </w:t>
-      </w:r>
-      <w:proofErr w:type="spellStart"/>
-      <w:r>
-        <w:rPr>
-          <w:rFonts w:cstheme="minorHAnsi"/>
-        </w:rPr>
-        <w:t>plasate</w:t>
-      </w:r>
-      <w:proofErr w:type="spellEnd"/>
-      <w:r>
-        <w:rPr>
-          <w:rFonts w:cstheme="minorHAnsi"/>
-        </w:rPr>
-        <w:t xml:space="preserve"> de </w:t>
-      </w:r>
-      <w:proofErr w:type="spellStart"/>
-      <w:r>
-        <w:rPr>
-          <w:rFonts w:cstheme="minorHAnsi"/>
-        </w:rPr>
-        <w:t>clienți</w:t>
-      </w:r>
-      <w:proofErr w:type="spellEnd"/>
-      <w:r>
-        <w:rPr>
-          <w:rFonts w:cstheme="minorHAnsi"/>
-        </w:rPr>
-        <w:t>.</w:t>
+          <w:lang w:val="ro-RO"/>
+        </w:rPr>
+      </w:pPr>
+      <w:r>
+        <w:rPr>
+          <w:rFonts w:cstheme="minorHAnsi"/>
+          <w:lang w:val="ro-RO"/>
+        </w:rPr>
+        <w:t>Se cere realizarea unei aplicații software pentru gestionarea activității unui drinks shop, care să permită administrarea produselor vândute (băuturi), a ingredientelor utilizate, a rețetelor de preparare și a comenzilor plasate de clienți.</w:t>
       </w:r>
     </w:p>
     <w:p>
@@ -367,315 +63,15 @@
         <w:jc w:val="both"/>
         <w:rPr>
           <w:rFonts w:cstheme="minorHAnsi"/>
-        </w:rPr>
-      </w:pPr>
-      <w:proofErr w:type="spellStart"/>
-      <w:r>
-        <w:rPr>
-          <w:rFonts w:cstheme="minorHAnsi"/>
-        </w:rPr>
-        <w:t>Aplicația</w:t>
-      </w:r>
-      <w:proofErr w:type="spellEnd"/>
-      <w:r>
-        <w:rPr>
-          <w:rFonts w:cstheme="minorHAnsi"/>
-        </w:rPr>
-        <w:t xml:space="preserve"> </w:t>
-      </w:r>
-      <w:proofErr w:type="spellStart"/>
-      <w:r>
-        <w:rPr>
-          <w:rFonts w:cstheme="minorHAnsi"/>
-        </w:rPr>
-        <w:t>trebuie</w:t>
-      </w:r>
-      <w:proofErr w:type="spellEnd"/>
-      <w:r>
-        <w:rPr>
-          <w:rFonts w:cstheme="minorHAnsi"/>
-        </w:rPr>
-        <w:t xml:space="preserve"> </w:t>
-      </w:r>
-      <w:proofErr w:type="spellStart"/>
-      <w:r>
-        <w:rPr>
-          <w:rFonts w:cstheme="minorHAnsi"/>
-        </w:rPr>
-        <w:t>să</w:t>
-      </w:r>
-      <w:proofErr w:type="spellEnd"/>
-      <w:r>
-        <w:rPr>
-          <w:rFonts w:cstheme="minorHAnsi"/>
-        </w:rPr>
-        <w:t xml:space="preserve"> </w:t>
-      </w:r>
-      <w:proofErr w:type="spellStart"/>
-      <w:r>
-        <w:rPr>
-          <w:rFonts w:cstheme="minorHAnsi"/>
-        </w:rPr>
-        <w:t>ofere</w:t>
-      </w:r>
-      <w:proofErr w:type="spellEnd"/>
-      <w:r>
-        <w:rPr>
-          <w:rFonts w:cstheme="minorHAnsi"/>
-        </w:rPr>
-        <w:t xml:space="preserve"> </w:t>
-      </w:r>
-      <w:proofErr w:type="spellStart"/>
-      <w:r>
-        <w:rPr>
-          <w:rFonts w:cstheme="minorHAnsi"/>
-        </w:rPr>
-        <w:t>funcționalități</w:t>
-      </w:r>
-      <w:proofErr w:type="spellEnd"/>
-      <w:r>
-        <w:rPr>
-          <w:rFonts w:cstheme="minorHAnsi"/>
-        </w:rPr>
-        <w:t xml:space="preserve"> complete de </w:t>
-      </w:r>
-      <w:proofErr w:type="spellStart"/>
-      <w:r>
-        <w:rPr>
-          <w:rFonts w:cstheme="minorHAnsi"/>
-        </w:rPr>
-        <w:t>gestiune</w:t>
-      </w:r>
-      <w:proofErr w:type="spellEnd"/>
-      <w:r>
-        <w:rPr>
-          <w:rFonts w:cstheme="minorHAnsi"/>
-        </w:rPr>
-        <w:t xml:space="preserve"> (</w:t>
-      </w:r>
-      <w:proofErr w:type="spellStart"/>
-      <w:r>
-        <w:rPr>
-          <w:rFonts w:cstheme="minorHAnsi"/>
-        </w:rPr>
-        <w:t>adăugare</w:t>
-      </w:r>
-      <w:proofErr w:type="spellEnd"/>
-      <w:r>
-        <w:rPr>
-          <w:rFonts w:cstheme="minorHAnsi"/>
-        </w:rPr>
-        <w:t xml:space="preserve">, </w:t>
-      </w:r>
-      <w:proofErr w:type="spellStart"/>
-      <w:r>
-        <w:rPr>
-          <w:rFonts w:cstheme="minorHAnsi"/>
-        </w:rPr>
-        <w:t>modificare</w:t>
-      </w:r>
-      <w:proofErr w:type="spellEnd"/>
-      <w:r>
-        <w:rPr>
-          <w:rFonts w:cstheme="minorHAnsi"/>
-        </w:rPr>
-        <w:t xml:space="preserve">, </w:t>
-      </w:r>
-      <w:proofErr w:type="spellStart"/>
-      <w:r>
-        <w:rPr>
-          <w:rFonts w:cstheme="minorHAnsi"/>
-        </w:rPr>
-        <w:t>ștergere</w:t>
-      </w:r>
-      <w:proofErr w:type="spellEnd"/>
-      <w:r>
-        <w:rPr>
-          <w:rFonts w:cstheme="minorHAnsi"/>
-        </w:rPr>
-        <w:t xml:space="preserve">, </w:t>
-      </w:r>
-      <w:proofErr w:type="spellStart"/>
-      <w:r>
-        <w:rPr>
-          <w:rFonts w:cstheme="minorHAnsi"/>
-        </w:rPr>
-        <w:t>vizualizare</w:t>
-      </w:r>
-      <w:proofErr w:type="spellEnd"/>
-      <w:r>
-        <w:rPr>
-          <w:rFonts w:cstheme="minorHAnsi"/>
-        </w:rPr>
-        <w:t xml:space="preserve">), </w:t>
-      </w:r>
-      <w:proofErr w:type="spellStart"/>
-      <w:r>
-        <w:rPr>
-          <w:rFonts w:cstheme="minorHAnsi"/>
-        </w:rPr>
-        <w:t>să</w:t>
-      </w:r>
-      <w:proofErr w:type="spellEnd"/>
-      <w:r>
-        <w:rPr>
-          <w:rFonts w:cstheme="minorHAnsi"/>
-        </w:rPr>
-        <w:t xml:space="preserve"> </w:t>
-      </w:r>
-      <w:proofErr w:type="spellStart"/>
-      <w:r>
-        <w:rPr>
-          <w:rFonts w:cstheme="minorHAnsi"/>
-        </w:rPr>
-        <w:t>asigure</w:t>
-      </w:r>
-      <w:proofErr w:type="spellEnd"/>
-      <w:r>
-        <w:rPr>
-          <w:rFonts w:cstheme="minorHAnsi"/>
-        </w:rPr>
-        <w:t xml:space="preserve"> </w:t>
-      </w:r>
-      <w:proofErr w:type="spellStart"/>
-      <w:r>
-        <w:rPr>
-          <w:rFonts w:cstheme="minorHAnsi"/>
-        </w:rPr>
-        <w:t>persistența</w:t>
-      </w:r>
-      <w:proofErr w:type="spellEnd"/>
-      <w:r>
-        <w:rPr>
-          <w:rFonts w:cstheme="minorHAnsi"/>
-        </w:rPr>
-        <w:t xml:space="preserve"> </w:t>
-      </w:r>
-      <w:proofErr w:type="spellStart"/>
-      <w:r>
-        <w:rPr>
-          <w:rFonts w:cstheme="minorHAnsi"/>
-        </w:rPr>
-        <w:t>datelor</w:t>
-      </w:r>
-      <w:proofErr w:type="spellEnd"/>
-      <w:r>
-        <w:rPr>
-          <w:rFonts w:cstheme="minorHAnsi"/>
-        </w:rPr>
-        <w:t xml:space="preserve"> </w:t>
-      </w:r>
-      <w:proofErr w:type="spellStart"/>
-      <w:r>
-        <w:rPr>
-          <w:rFonts w:cstheme="minorHAnsi"/>
-        </w:rPr>
-        <w:t>în</w:t>
-      </w:r>
-      <w:proofErr w:type="spellEnd"/>
-      <w:r>
-        <w:rPr>
-          <w:rFonts w:cstheme="minorHAnsi"/>
-        </w:rPr>
-        <w:t xml:space="preserve"> </w:t>
-      </w:r>
-      <w:proofErr w:type="spellStart"/>
-      <w:r>
-        <w:rPr>
-          <w:rFonts w:cstheme="minorHAnsi"/>
-        </w:rPr>
-        <w:t>fișiere</w:t>
-      </w:r>
-      <w:proofErr w:type="spellEnd"/>
-      <w:r>
-        <w:rPr>
-          <w:rFonts w:cstheme="minorHAnsi"/>
-        </w:rPr>
-        <w:t xml:space="preserve">, precum </w:t>
-      </w:r>
-      <w:proofErr w:type="spellStart"/>
-      <w:r>
-        <w:rPr>
-          <w:rFonts w:cstheme="minorHAnsi"/>
-        </w:rPr>
-        <w:t>și</w:t>
-      </w:r>
-      <w:proofErr w:type="spellEnd"/>
-      <w:r>
-        <w:rPr>
-          <w:rFonts w:cstheme="minorHAnsi"/>
-        </w:rPr>
-        <w:t xml:space="preserve"> o </w:t>
-      </w:r>
-      <w:proofErr w:type="spellStart"/>
-      <w:r>
-        <w:rPr>
-          <w:rFonts w:cstheme="minorHAnsi"/>
-        </w:rPr>
-        <w:t>interfață</w:t>
-      </w:r>
-      <w:proofErr w:type="spellEnd"/>
-      <w:r>
-        <w:rPr>
-          <w:rFonts w:cstheme="minorHAnsi"/>
-        </w:rPr>
-        <w:t xml:space="preserve"> </w:t>
-      </w:r>
-      <w:proofErr w:type="spellStart"/>
-      <w:r>
-        <w:rPr>
-          <w:rFonts w:cstheme="minorHAnsi"/>
-        </w:rPr>
-        <w:t>grafică</w:t>
-      </w:r>
-      <w:proofErr w:type="spellEnd"/>
-      <w:r>
-        <w:rPr>
-          <w:rFonts w:cstheme="minorHAnsi"/>
-        </w:rPr>
-        <w:t xml:space="preserve"> </w:t>
-      </w:r>
-      <w:proofErr w:type="spellStart"/>
-      <w:r>
-        <w:rPr>
-          <w:rFonts w:cstheme="minorHAnsi"/>
-        </w:rPr>
-        <w:t>intuitivă</w:t>
-      </w:r>
-      <w:proofErr w:type="spellEnd"/>
-      <w:r>
-        <w:rPr>
-          <w:rFonts w:cstheme="minorHAnsi"/>
-        </w:rPr>
-        <w:t xml:space="preserve"> </w:t>
-      </w:r>
-      <w:proofErr w:type="spellStart"/>
-      <w:r>
-        <w:rPr>
-          <w:rFonts w:cstheme="minorHAnsi"/>
-        </w:rPr>
-        <w:t>pentru</w:t>
-      </w:r>
-      <w:proofErr w:type="spellEnd"/>
-      <w:r>
-        <w:rPr>
-          <w:rFonts w:cstheme="minorHAnsi"/>
-        </w:rPr>
-        <w:t xml:space="preserve"> </w:t>
-      </w:r>
-      <w:proofErr w:type="spellStart"/>
-      <w:r>
-        <w:rPr>
-          <w:rFonts w:cstheme="minorHAnsi"/>
-        </w:rPr>
-        <w:t>utilizator</w:t>
-      </w:r>
-      <w:proofErr w:type="spellEnd"/>
-      <w:r>
-        <w:rPr>
-          <w:rFonts w:cstheme="minorHAnsi"/>
-        </w:rPr>
-        <w:t>.</w:t>
+          <w:lang w:val="ro-RO"/>
+        </w:rPr>
+      </w:pPr>
+      <w:r>
+        <w:rPr>
+          <w:rFonts w:cstheme="minorHAnsi"/>
+          <w:lang w:val="ro-RO"/>
+        </w:rPr>
+        <w:t>Aplicația trebuie să ofere funcționalități complete de gestiune (adăugare, modificare, ștergere, vizualizare), să asigure persistența datelor în fișiere, precum și o interfață grafică intuitivă pentru utilizator.</w:t>
       </w:r>
     </w:p>
     <w:p>
@@ -689,175 +85,15 @@
         <w:jc w:val="both"/>
         <w:rPr>
           <w:rFonts w:cstheme="minorHAnsi"/>
-        </w:rPr>
-      </w:pPr>
-      <w:proofErr w:type="spellStart"/>
-      <w:r>
-        <w:rPr>
-          <w:rFonts w:cstheme="minorHAnsi"/>
-        </w:rPr>
-        <w:t>Soluția</w:t>
-      </w:r>
-      <w:proofErr w:type="spellEnd"/>
-      <w:r>
-        <w:rPr>
-          <w:rFonts w:cstheme="minorHAnsi"/>
-        </w:rPr>
-        <w:t xml:space="preserve"> </w:t>
-      </w:r>
-      <w:proofErr w:type="spellStart"/>
-      <w:r>
-        <w:rPr>
-          <w:rFonts w:cstheme="minorHAnsi"/>
-        </w:rPr>
-        <w:t>trebuie</w:t>
-      </w:r>
-      <w:proofErr w:type="spellEnd"/>
-      <w:r>
-        <w:rPr>
-          <w:rFonts w:cstheme="minorHAnsi"/>
-        </w:rPr>
-        <w:t xml:space="preserve"> </w:t>
-      </w:r>
-      <w:proofErr w:type="spellStart"/>
-      <w:r>
-        <w:rPr>
-          <w:rFonts w:cstheme="minorHAnsi"/>
-        </w:rPr>
-        <w:t>implementată</w:t>
-      </w:r>
-      <w:proofErr w:type="spellEnd"/>
-      <w:r>
-        <w:rPr>
-          <w:rFonts w:cstheme="minorHAnsi"/>
-        </w:rPr>
-        <w:t xml:space="preserve"> </w:t>
-      </w:r>
-      <w:proofErr w:type="spellStart"/>
-      <w:r>
-        <w:rPr>
-          <w:rFonts w:cstheme="minorHAnsi"/>
-        </w:rPr>
-        <w:t>respectând</w:t>
-      </w:r>
-      <w:proofErr w:type="spellEnd"/>
-      <w:r>
-        <w:rPr>
-          <w:rFonts w:cstheme="minorHAnsi"/>
-        </w:rPr>
-        <w:t xml:space="preserve"> </w:t>
-      </w:r>
-      <w:proofErr w:type="spellStart"/>
-      <w:r>
-        <w:rPr>
-          <w:rFonts w:cstheme="minorHAnsi"/>
-        </w:rPr>
-        <w:t>principiile</w:t>
-      </w:r>
-      <w:proofErr w:type="spellEnd"/>
-      <w:r>
-        <w:rPr>
-          <w:rFonts w:cstheme="minorHAnsi"/>
-        </w:rPr>
-        <w:t xml:space="preserve"> </w:t>
-      </w:r>
-      <w:proofErr w:type="spellStart"/>
-      <w:r>
-        <w:rPr>
-          <w:rFonts w:cstheme="minorHAnsi"/>
-        </w:rPr>
-        <w:t>programării</w:t>
-      </w:r>
-      <w:proofErr w:type="spellEnd"/>
-      <w:r>
-        <w:rPr>
-          <w:rFonts w:cstheme="minorHAnsi"/>
-        </w:rPr>
-        <w:t xml:space="preserve"> orientate pe </w:t>
-      </w:r>
-      <w:proofErr w:type="spellStart"/>
-      <w:r>
-        <w:rPr>
-          <w:rFonts w:cstheme="minorHAnsi"/>
-        </w:rPr>
-        <w:t>obiect</w:t>
-      </w:r>
-      <w:proofErr w:type="spellEnd"/>
-      <w:r>
-        <w:rPr>
-          <w:rFonts w:cstheme="minorHAnsi"/>
-        </w:rPr>
-        <w:t xml:space="preserve"> </w:t>
-      </w:r>
-      <w:proofErr w:type="spellStart"/>
-      <w:r>
-        <w:rPr>
-          <w:rFonts w:cstheme="minorHAnsi"/>
-        </w:rPr>
-        <w:t>și</w:t>
-      </w:r>
-      <w:proofErr w:type="spellEnd"/>
-      <w:r>
-        <w:rPr>
-          <w:rFonts w:cstheme="minorHAnsi"/>
-        </w:rPr>
-        <w:t xml:space="preserve"> o </w:t>
-      </w:r>
-      <w:proofErr w:type="spellStart"/>
-      <w:r>
-        <w:rPr>
-          <w:rFonts w:cstheme="minorHAnsi"/>
-        </w:rPr>
-        <w:t>arhitectură</w:t>
-      </w:r>
-      <w:proofErr w:type="spellEnd"/>
-      <w:r>
-        <w:rPr>
-          <w:rFonts w:cstheme="minorHAnsi"/>
-        </w:rPr>
-        <w:t xml:space="preserve"> </w:t>
-      </w:r>
-      <w:proofErr w:type="spellStart"/>
-      <w:r>
-        <w:rPr>
-          <w:rFonts w:cstheme="minorHAnsi"/>
-        </w:rPr>
-        <w:t>stratificată</w:t>
-      </w:r>
-      <w:proofErr w:type="spellEnd"/>
-      <w:r>
-        <w:rPr>
-          <w:rFonts w:cstheme="minorHAnsi"/>
-        </w:rPr>
-        <w:t xml:space="preserve">, care </w:t>
-      </w:r>
-      <w:proofErr w:type="spellStart"/>
-      <w:r>
-        <w:rPr>
-          <w:rFonts w:cstheme="minorHAnsi"/>
-        </w:rPr>
-        <w:t>separă</w:t>
-      </w:r>
-      <w:proofErr w:type="spellEnd"/>
-      <w:r>
-        <w:rPr>
-          <w:rFonts w:cstheme="minorHAnsi"/>
-        </w:rPr>
-        <w:t xml:space="preserve"> </w:t>
-      </w:r>
-      <w:proofErr w:type="spellStart"/>
-      <w:r>
-        <w:rPr>
-          <w:rFonts w:cstheme="minorHAnsi"/>
-        </w:rPr>
-        <w:t>clar</w:t>
-      </w:r>
-      <w:proofErr w:type="spellEnd"/>
-      <w:r>
-        <w:rPr>
-          <w:rFonts w:cstheme="minorHAnsi"/>
-        </w:rPr>
-        <w:t>:</w:t>
+          <w:lang w:val="ro-RO"/>
+        </w:rPr>
+      </w:pPr>
+      <w:r>
+        <w:rPr>
+          <w:rFonts w:cstheme="minorHAnsi"/>
+          <w:lang w:val="ro-RO"/>
+        </w:rPr>
+        <w:t>Soluția trebuie implementată respectând principiile programării orientate pe obiect și o arhitectură stratificată, care separă clar:</w:t>
       </w:r>
     </w:p>
     <w:p>
@@ -875,21 +111,15 @@
         <w:jc w:val="both"/>
         <w:rPr>
           <w:rFonts w:cstheme="minorHAnsi"/>
-        </w:rPr>
-      </w:pPr>
-      <w:proofErr w:type="spellStart"/>
-      <w:r>
-        <w:rPr>
-          <w:rFonts w:cstheme="minorHAnsi"/>
-        </w:rPr>
-        <w:t>modelul</w:t>
-      </w:r>
-      <w:proofErr w:type="spellEnd"/>
-      <w:r>
-        <w:rPr>
-          <w:rFonts w:cstheme="minorHAnsi"/>
-        </w:rPr>
-        <w:t xml:space="preserve"> de date,</w:t>
+          <w:lang w:val="ro-RO"/>
+        </w:rPr>
+      </w:pPr>
+      <w:r>
+        <w:rPr>
+          <w:rFonts w:cstheme="minorHAnsi"/>
+          <w:lang w:val="ro-RO"/>
+        </w:rPr>
+        <w:t>modelul de date,</w:t>
       </w:r>
     </w:p>
     <w:p>
@@ -907,21 +137,15 @@
         <w:jc w:val="both"/>
         <w:rPr>
           <w:rFonts w:cstheme="minorHAnsi"/>
-        </w:rPr>
-      </w:pPr>
-      <w:proofErr w:type="spellStart"/>
-      <w:r>
-        <w:rPr>
-          <w:rFonts w:cstheme="minorHAnsi"/>
-        </w:rPr>
-        <w:t>logica</w:t>
-      </w:r>
-      <w:proofErr w:type="spellEnd"/>
-      <w:r>
-        <w:rPr>
-          <w:rFonts w:cstheme="minorHAnsi"/>
-        </w:rPr>
-        <w:t xml:space="preserve"> de business,</w:t>
+          <w:lang w:val="ro-RO"/>
+        </w:rPr>
+      </w:pPr>
+      <w:r>
+        <w:rPr>
+          <w:rFonts w:cstheme="minorHAnsi"/>
+          <w:lang w:val="ro-RO"/>
+        </w:rPr>
+        <w:t>logica de business,</w:t>
       </w:r>
     </w:p>
     <w:p>
@@ -939,21 +163,15 @@
         <w:jc w:val="both"/>
         <w:rPr>
           <w:rFonts w:cstheme="minorHAnsi"/>
-        </w:rPr>
-      </w:pPr>
-      <w:proofErr w:type="spellStart"/>
-      <w:r>
-        <w:rPr>
-          <w:rFonts w:cstheme="minorHAnsi"/>
-        </w:rPr>
-        <w:t>accesul</w:t>
-      </w:r>
-      <w:proofErr w:type="spellEnd"/>
-      <w:r>
-        <w:rPr>
-          <w:rFonts w:cstheme="minorHAnsi"/>
-        </w:rPr>
-        <w:t xml:space="preserve"> la date,</w:t>
+          <w:lang w:val="ro-RO"/>
+        </w:rPr>
+      </w:pPr>
+      <w:r>
+        <w:rPr>
+          <w:rFonts w:cstheme="minorHAnsi"/>
+          <w:lang w:val="ro-RO"/>
+        </w:rPr>
+        <w:t>accesul la date,</w:t>
       </w:r>
     </w:p>
     <w:p>
@@ -971,35 +189,15 @@
         <w:jc w:val="both"/>
         <w:rPr>
           <w:rFonts w:cstheme="minorHAnsi"/>
-        </w:rPr>
-      </w:pPr>
-      <w:proofErr w:type="spellStart"/>
-      <w:r>
-        <w:rPr>
-          <w:rFonts w:cstheme="minorHAnsi"/>
-        </w:rPr>
-        <w:t>interfața</w:t>
-      </w:r>
-      <w:proofErr w:type="spellEnd"/>
-      <w:r>
-        <w:rPr>
-          <w:rFonts w:cstheme="minorHAnsi"/>
-        </w:rPr>
-        <w:t xml:space="preserve"> cu </w:t>
-      </w:r>
-      <w:proofErr w:type="spellStart"/>
-      <w:r>
-        <w:rPr>
-          <w:rFonts w:cstheme="minorHAnsi"/>
-        </w:rPr>
-        <w:t>utilizatorul</w:t>
-      </w:r>
-      <w:proofErr w:type="spellEnd"/>
-      <w:r>
-        <w:rPr>
-          <w:rFonts w:cstheme="minorHAnsi"/>
-        </w:rPr>
-        <w:t>.</w:t>
+          <w:lang w:val="ro-RO"/>
+        </w:rPr>
+      </w:pPr>
+      <w:r>
+        <w:rPr>
+          <w:rFonts w:cstheme="minorHAnsi"/>
+          <w:lang w:val="ro-RO"/>
+        </w:rPr>
+        <w:t>interfața cu utilizatorul.</w:t>
       </w:r>
     </w:p>
     <w:p>
@@ -1013,6 +211,7 @@
         <w:jc w:val="both"/>
         <w:rPr>
           <w:rFonts w:cstheme="minorHAnsi"/>
+          <w:lang w:val="ro-RO"/>
         </w:rPr>
       </w:pPr>
     </w:p>
@@ -1027,30 +226,16 @@
         <w:jc w:val="both"/>
         <w:rPr>
           <w:rFonts w:cstheme="minorHAnsi"/>
-        </w:rPr>
-      </w:pPr>
-      <w:proofErr w:type="spellStart"/>
-      <w:r>
-        <w:rPr>
-          <w:rFonts w:cstheme="minorHAnsi"/>
-        </w:rPr>
-        <w:t>Cerințe</w:t>
-      </w:r>
-      <w:proofErr w:type="spellEnd"/>
-      <w:r>
-        <w:rPr>
-          <w:rFonts w:cstheme="minorHAnsi"/>
-        </w:rPr>
-        <w:t xml:space="preserve"> </w:t>
-      </w:r>
-      <w:proofErr w:type="spellStart"/>
-      <w:r>
-        <w:rPr>
-          <w:rFonts w:cstheme="minorHAnsi"/>
-        </w:rPr>
-        <w:t>funcționale</w:t>
-      </w:r>
-      <w:proofErr w:type="spellEnd"/>
+          <w:lang w:val="ro-RO"/>
+        </w:rPr>
+      </w:pPr>
+      <w:r>
+        <w:rPr>
+          <w:rFonts w:cstheme="minorHAnsi"/>
+          <w:lang w:val="ro-RO"/>
+        </w:rPr>
+        <w:t>Cerințe funcționale</w:t>
+      </w:r>
     </w:p>
     <w:p>
       <w:pPr>
@@ -1067,105 +252,15 @@
         <w:jc w:val="both"/>
         <w:rPr>
           <w:rFonts w:cstheme="minorHAnsi"/>
-        </w:rPr>
-      </w:pPr>
-      <w:proofErr w:type="spellStart"/>
-      <w:r>
-        <w:rPr>
-          <w:rFonts w:cstheme="minorHAnsi"/>
-        </w:rPr>
-        <w:t>Aplicația</w:t>
-      </w:r>
-      <w:proofErr w:type="spellEnd"/>
-      <w:r>
-        <w:rPr>
-          <w:rFonts w:cstheme="minorHAnsi"/>
-        </w:rPr>
-        <w:t xml:space="preserve"> </w:t>
-      </w:r>
-      <w:proofErr w:type="spellStart"/>
-      <w:r>
-        <w:rPr>
-          <w:rFonts w:cstheme="minorHAnsi"/>
-        </w:rPr>
-        <w:t>trebuie</w:t>
-      </w:r>
-      <w:proofErr w:type="spellEnd"/>
-      <w:r>
-        <w:rPr>
-          <w:rFonts w:cstheme="minorHAnsi"/>
-        </w:rPr>
-        <w:t xml:space="preserve"> </w:t>
-      </w:r>
-      <w:proofErr w:type="spellStart"/>
-      <w:r>
-        <w:rPr>
-          <w:rFonts w:cstheme="minorHAnsi"/>
-        </w:rPr>
-        <w:t>să</w:t>
-      </w:r>
-      <w:proofErr w:type="spellEnd"/>
-      <w:r>
-        <w:rPr>
-          <w:rFonts w:cstheme="minorHAnsi"/>
-        </w:rPr>
-        <w:t xml:space="preserve"> </w:t>
-      </w:r>
-      <w:proofErr w:type="spellStart"/>
-      <w:r>
-        <w:rPr>
-          <w:rFonts w:cstheme="minorHAnsi"/>
-        </w:rPr>
-        <w:t>permită</w:t>
-      </w:r>
-      <w:proofErr w:type="spellEnd"/>
-      <w:r>
-        <w:rPr>
-          <w:rFonts w:cstheme="minorHAnsi"/>
-        </w:rPr>
-        <w:t xml:space="preserve"> </w:t>
-      </w:r>
-      <w:proofErr w:type="spellStart"/>
-      <w:r>
-        <w:rPr>
-          <w:rFonts w:cstheme="minorHAnsi"/>
-        </w:rPr>
-        <w:t>gestionarea</w:t>
-      </w:r>
-      <w:proofErr w:type="spellEnd"/>
-      <w:r>
-        <w:rPr>
-          <w:rFonts w:cstheme="minorHAnsi"/>
-        </w:rPr>
-        <w:t xml:space="preserve"> </w:t>
-      </w:r>
-      <w:proofErr w:type="spellStart"/>
-      <w:r>
-        <w:rPr>
-          <w:rFonts w:cstheme="minorHAnsi"/>
-        </w:rPr>
-        <w:t>produselor</w:t>
-      </w:r>
-      <w:proofErr w:type="spellEnd"/>
-      <w:r>
-        <w:rPr>
-          <w:rFonts w:cstheme="minorHAnsi"/>
-        </w:rPr>
-        <w:t xml:space="preserve"> (</w:t>
-      </w:r>
-      <w:proofErr w:type="spellStart"/>
-      <w:r>
-        <w:rPr>
-          <w:rFonts w:cstheme="minorHAnsi"/>
-        </w:rPr>
-        <w:t>băuturi</w:t>
-      </w:r>
-      <w:proofErr w:type="spellEnd"/>
-      <w:r>
-        <w:rPr>
-          <w:rFonts w:cstheme="minorHAnsi"/>
-        </w:rPr>
-        <w:t>):</w:t>
+          <w:lang w:val="ro-RO"/>
+        </w:rPr>
+      </w:pPr>
+      <w:r>
+        <w:rPr>
+          <w:rFonts w:cstheme="minorHAnsi"/>
+          <w:lang w:val="ro-RO"/>
+        </w:rPr>
+        <w:t>Aplicația trebuie să permită gestionarea produselor (băuturi):</w:t>
       </w:r>
     </w:p>
     <w:p>
@@ -1183,35 +278,15 @@
         <w:jc w:val="both"/>
         <w:rPr>
           <w:rFonts w:cstheme="minorHAnsi"/>
-        </w:rPr>
-      </w:pPr>
-      <w:proofErr w:type="spellStart"/>
-      <w:r>
-        <w:rPr>
-          <w:rFonts w:cstheme="minorHAnsi"/>
-        </w:rPr>
-        <w:t>adăugare</w:t>
-      </w:r>
-      <w:proofErr w:type="spellEnd"/>
-      <w:r>
-        <w:rPr>
-          <w:rFonts w:cstheme="minorHAnsi"/>
-        </w:rPr>
-        <w:t xml:space="preserve"> </w:t>
-      </w:r>
-      <w:proofErr w:type="spellStart"/>
-      <w:r>
-        <w:rPr>
-          <w:rFonts w:cstheme="minorHAnsi"/>
-        </w:rPr>
-        <w:t>produs</w:t>
-      </w:r>
-      <w:proofErr w:type="spellEnd"/>
-      <w:r>
-        <w:rPr>
-          <w:rFonts w:cstheme="minorHAnsi"/>
-        </w:rPr>
-        <w:t xml:space="preserve"> nou;</w:t>
+          <w:lang w:val="ro-RO"/>
+        </w:rPr>
+      </w:pPr>
+      <w:r>
+        <w:rPr>
+          <w:rFonts w:cstheme="minorHAnsi"/>
+          <w:lang w:val="ro-RO"/>
+        </w:rPr>
+        <w:t>adăugare produs nou;</w:t>
       </w:r>
     </w:p>
     <w:p>
@@ -1229,35 +304,15 @@
         <w:jc w:val="both"/>
         <w:rPr>
           <w:rFonts w:cstheme="minorHAnsi"/>
-        </w:rPr>
-      </w:pPr>
-      <w:proofErr w:type="spellStart"/>
-      <w:r>
-        <w:rPr>
-          <w:rFonts w:cstheme="minorHAnsi"/>
-        </w:rPr>
-        <w:t>modificare</w:t>
-      </w:r>
-      <w:proofErr w:type="spellEnd"/>
-      <w:r>
-        <w:rPr>
-          <w:rFonts w:cstheme="minorHAnsi"/>
-        </w:rPr>
-        <w:t xml:space="preserve"> </w:t>
-      </w:r>
-      <w:proofErr w:type="spellStart"/>
-      <w:r>
-        <w:rPr>
-          <w:rFonts w:cstheme="minorHAnsi"/>
-        </w:rPr>
-        <w:t>produs</w:t>
-      </w:r>
-      <w:proofErr w:type="spellEnd"/>
-      <w:r>
-        <w:rPr>
-          <w:rFonts w:cstheme="minorHAnsi"/>
-        </w:rPr>
-        <w:t xml:space="preserve"> existent;</w:t>
+          <w:lang w:val="ro-RO"/>
+        </w:rPr>
+      </w:pPr>
+      <w:r>
+        <w:rPr>
+          <w:rFonts w:cstheme="minorHAnsi"/>
+          <w:lang w:val="ro-RO"/>
+        </w:rPr>
+        <w:t>modificare produs existent;</w:t>
       </w:r>
     </w:p>
     <w:p>
@@ -1275,35 +330,15 @@
         <w:jc w:val="both"/>
         <w:rPr>
           <w:rFonts w:cstheme="minorHAnsi"/>
-        </w:rPr>
-      </w:pPr>
-      <w:proofErr w:type="spellStart"/>
-      <w:r>
-        <w:rPr>
-          <w:rFonts w:cstheme="minorHAnsi"/>
-        </w:rPr>
-        <w:t>ștergere</w:t>
-      </w:r>
-      <w:proofErr w:type="spellEnd"/>
-      <w:r>
-        <w:rPr>
-          <w:rFonts w:cstheme="minorHAnsi"/>
-        </w:rPr>
-        <w:t xml:space="preserve"> </w:t>
-      </w:r>
-      <w:proofErr w:type="spellStart"/>
-      <w:r>
-        <w:rPr>
-          <w:rFonts w:cstheme="minorHAnsi"/>
-        </w:rPr>
-        <w:t>produs</w:t>
-      </w:r>
-      <w:proofErr w:type="spellEnd"/>
-      <w:r>
-        <w:rPr>
-          <w:rFonts w:cstheme="minorHAnsi"/>
-        </w:rPr>
-        <w:t>;</w:t>
+          <w:lang w:val="ro-RO"/>
+        </w:rPr>
+      </w:pPr>
+      <w:r>
+        <w:rPr>
+          <w:rFonts w:cstheme="minorHAnsi"/>
+          <w:lang w:val="ro-RO"/>
+        </w:rPr>
+        <w:t>ștergere produs;</w:t>
       </w:r>
     </w:p>
     <w:p>
@@ -1321,49 +356,15 @@
         <w:jc w:val="both"/>
         <w:rPr>
           <w:rFonts w:cstheme="minorHAnsi"/>
-        </w:rPr>
-      </w:pPr>
-      <w:proofErr w:type="spellStart"/>
-      <w:r>
-        <w:rPr>
-          <w:rFonts w:cstheme="minorHAnsi"/>
-        </w:rPr>
-        <w:t>afișare</w:t>
-      </w:r>
-      <w:proofErr w:type="spellEnd"/>
-      <w:r>
-        <w:rPr>
-          <w:rFonts w:cstheme="minorHAnsi"/>
-        </w:rPr>
-        <w:t xml:space="preserve"> </w:t>
-      </w:r>
-      <w:proofErr w:type="spellStart"/>
-      <w:r>
-        <w:rPr>
-          <w:rFonts w:cstheme="minorHAnsi"/>
-        </w:rPr>
-        <w:t>listă</w:t>
-      </w:r>
-      <w:proofErr w:type="spellEnd"/>
-      <w:r>
-        <w:rPr>
-          <w:rFonts w:cstheme="minorHAnsi"/>
-        </w:rPr>
-        <w:t xml:space="preserve"> </w:t>
-      </w:r>
-      <w:proofErr w:type="spellStart"/>
-      <w:r>
-        <w:rPr>
-          <w:rFonts w:cstheme="minorHAnsi"/>
-        </w:rPr>
-        <w:t>produse</w:t>
-      </w:r>
-      <w:proofErr w:type="spellEnd"/>
-      <w:r>
-        <w:rPr>
-          <w:rFonts w:cstheme="minorHAnsi"/>
-        </w:rPr>
-        <w:t>.</w:t>
+          <w:lang w:val="ro-RO"/>
+        </w:rPr>
+      </w:pPr>
+      <w:r>
+        <w:rPr>
+          <w:rFonts w:cstheme="minorHAnsi"/>
+          <w:lang w:val="ro-RO"/>
+        </w:rPr>
+        <w:t>afișare listă produse.</w:t>
       </w:r>
     </w:p>
     <w:p>
@@ -1381,133 +382,15 @@
         <w:jc w:val="both"/>
         <w:rPr>
           <w:rFonts w:cstheme="minorHAnsi"/>
-        </w:rPr>
-      </w:pPr>
-      <w:proofErr w:type="spellStart"/>
-      <w:r>
-        <w:rPr>
-          <w:rFonts w:cstheme="minorHAnsi"/>
-        </w:rPr>
-        <w:t>Fiecare</w:t>
-      </w:r>
-      <w:proofErr w:type="spellEnd"/>
-      <w:r>
-        <w:rPr>
-          <w:rFonts w:cstheme="minorHAnsi"/>
-        </w:rPr>
-        <w:t xml:space="preserve"> </w:t>
-      </w:r>
-      <w:proofErr w:type="spellStart"/>
-      <w:r>
-        <w:rPr>
-          <w:rFonts w:cstheme="minorHAnsi"/>
-        </w:rPr>
-        <w:t>produs</w:t>
-      </w:r>
-      <w:proofErr w:type="spellEnd"/>
-      <w:r>
-        <w:rPr>
-          <w:rFonts w:cstheme="minorHAnsi"/>
-        </w:rPr>
-        <w:t xml:space="preserve"> </w:t>
-      </w:r>
-      <w:proofErr w:type="spellStart"/>
-      <w:r>
-        <w:rPr>
-          <w:rFonts w:cstheme="minorHAnsi"/>
-        </w:rPr>
-        <w:t>trebuie</w:t>
-      </w:r>
-      <w:proofErr w:type="spellEnd"/>
-      <w:r>
-        <w:rPr>
-          <w:rFonts w:cstheme="minorHAnsi"/>
-        </w:rPr>
-        <w:t xml:space="preserve"> </w:t>
-      </w:r>
-      <w:proofErr w:type="spellStart"/>
-      <w:r>
-        <w:rPr>
-          <w:rFonts w:cstheme="minorHAnsi"/>
-        </w:rPr>
-        <w:t>să</w:t>
-      </w:r>
-      <w:proofErr w:type="spellEnd"/>
-      <w:r>
-        <w:rPr>
-          <w:rFonts w:cstheme="minorHAnsi"/>
-        </w:rPr>
-        <w:t xml:space="preserve"> </w:t>
-      </w:r>
-      <w:proofErr w:type="spellStart"/>
-      <w:r>
-        <w:rPr>
-          <w:rFonts w:cstheme="minorHAnsi"/>
-        </w:rPr>
-        <w:t>aparțină</w:t>
-      </w:r>
-      <w:proofErr w:type="spellEnd"/>
-      <w:r>
-        <w:rPr>
-          <w:rFonts w:cstheme="minorHAnsi"/>
-        </w:rPr>
-        <w:t xml:space="preserve"> </w:t>
-      </w:r>
-      <w:proofErr w:type="spellStart"/>
-      <w:r>
-        <w:rPr>
-          <w:rFonts w:cstheme="minorHAnsi"/>
-        </w:rPr>
-        <w:t>unui</w:t>
-      </w:r>
-      <w:proofErr w:type="spellEnd"/>
-      <w:r>
-        <w:rPr>
-          <w:rFonts w:cstheme="minorHAnsi"/>
-        </w:rPr>
-        <w:t xml:space="preserve"> tip </w:t>
-      </w:r>
-      <w:proofErr w:type="spellStart"/>
-      <w:r>
-        <w:rPr>
-          <w:rFonts w:cstheme="minorHAnsi"/>
-        </w:rPr>
-        <w:t>și</w:t>
-      </w:r>
-      <w:proofErr w:type="spellEnd"/>
-      <w:r>
-        <w:rPr>
-          <w:rFonts w:cstheme="minorHAnsi"/>
-        </w:rPr>
-        <w:t xml:space="preserve"> </w:t>
-      </w:r>
-      <w:proofErr w:type="spellStart"/>
-      <w:r>
-        <w:rPr>
-          <w:rFonts w:cstheme="minorHAnsi"/>
-        </w:rPr>
-        <w:t>unei</w:t>
-      </w:r>
-      <w:proofErr w:type="spellEnd"/>
-      <w:r>
-        <w:rPr>
-          <w:rFonts w:cstheme="minorHAnsi"/>
-        </w:rPr>
-        <w:t xml:space="preserve"> </w:t>
-      </w:r>
-      <w:proofErr w:type="spellStart"/>
-      <w:r>
-        <w:rPr>
-          <w:rFonts w:cstheme="minorHAnsi"/>
-        </w:rPr>
-        <w:t>categorii</w:t>
-      </w:r>
-      <w:proofErr w:type="spellEnd"/>
-      <w:r>
-        <w:rPr>
-          <w:rFonts w:cstheme="minorHAnsi"/>
-        </w:rPr>
-        <w:t>.</w:t>
+          <w:lang w:val="ro-RO"/>
+        </w:rPr>
+      </w:pPr>
+      <w:r>
+        <w:rPr>
+          <w:rFonts w:cstheme="minorHAnsi"/>
+          <w:lang w:val="ro-RO"/>
+        </w:rPr>
+        <w:t>Fiecare produs trebuie să aparțină unui tip și unei categorii.</w:t>
       </w:r>
     </w:p>
     <w:p>
@@ -1525,147 +408,17 @@
         <w:jc w:val="both"/>
         <w:rPr>
           <w:rFonts w:cstheme="minorHAnsi"/>
-        </w:rPr>
-      </w:pPr>
-      <w:proofErr w:type="spellStart"/>
-      <w:r>
-        <w:rPr>
-          <w:rFonts w:cstheme="minorHAnsi"/>
-        </w:rPr>
-        <w:t>Utilizatorul</w:t>
-      </w:r>
-      <w:proofErr w:type="spellEnd"/>
-      <w:r>
-        <w:rPr>
-          <w:rFonts w:cstheme="minorHAnsi"/>
-        </w:rPr>
-        <w:t xml:space="preserve"> </w:t>
-      </w:r>
-      <w:proofErr w:type="spellStart"/>
-      <w:r>
-        <w:rPr>
-          <w:rFonts w:cstheme="minorHAnsi"/>
-        </w:rPr>
-        <w:t>poate</w:t>
-      </w:r>
-      <w:proofErr w:type="spellEnd"/>
-      <w:r>
-        <w:rPr>
-          <w:rFonts w:cstheme="minorHAnsi"/>
-        </w:rPr>
-        <w:t xml:space="preserve"> </w:t>
-      </w:r>
-      <w:proofErr w:type="spellStart"/>
-      <w:r>
-        <w:rPr>
-          <w:rFonts w:cstheme="minorHAnsi"/>
-        </w:rPr>
-        <w:t>adăuga</w:t>
-      </w:r>
-      <w:proofErr w:type="spellEnd"/>
-      <w:r>
-        <w:rPr>
-          <w:rFonts w:cstheme="minorHAnsi"/>
-        </w:rPr>
-        <w:t xml:space="preserve">, </w:t>
-      </w:r>
-      <w:proofErr w:type="spellStart"/>
-      <w:r>
-        <w:rPr>
-          <w:rFonts w:cstheme="minorHAnsi"/>
-        </w:rPr>
-        <w:t>modifica</w:t>
-      </w:r>
-      <w:proofErr w:type="spellEnd"/>
-      <w:r>
-        <w:rPr>
-          <w:rFonts w:cstheme="minorHAnsi"/>
-        </w:rPr>
-        <w:t xml:space="preserve"> </w:t>
-      </w:r>
-      <w:proofErr w:type="spellStart"/>
-      <w:r>
-        <w:rPr>
-          <w:rFonts w:cstheme="minorHAnsi"/>
-        </w:rPr>
-        <w:t>și</w:t>
-      </w:r>
-      <w:proofErr w:type="spellEnd"/>
-      <w:r>
-        <w:rPr>
-          <w:rFonts w:cstheme="minorHAnsi"/>
-        </w:rPr>
-        <w:t xml:space="preserve"> </w:t>
-      </w:r>
-      <w:proofErr w:type="spellStart"/>
-      <w:r>
-        <w:rPr>
-          <w:rFonts w:cstheme="minorHAnsi"/>
-        </w:rPr>
-        <w:t>șterge</w:t>
-      </w:r>
-      <w:proofErr w:type="spellEnd"/>
-      <w:r>
-        <w:rPr>
-          <w:rFonts w:cstheme="minorHAnsi"/>
-        </w:rPr>
-        <w:t xml:space="preserve"> </w:t>
-      </w:r>
-      <w:proofErr w:type="spellStart"/>
-      <w:r>
-        <w:rPr>
-          <w:rFonts w:cstheme="minorHAnsi"/>
-        </w:rPr>
-        <w:t>tipuri</w:t>
-      </w:r>
-      <w:proofErr w:type="spellEnd"/>
-      <w:r>
-        <w:rPr>
-          <w:rFonts w:cstheme="minorHAnsi"/>
-        </w:rPr>
-        <w:t xml:space="preserve"> </w:t>
-      </w:r>
-      <w:proofErr w:type="spellStart"/>
-      <w:r>
-        <w:rPr>
-          <w:rFonts w:cstheme="minorHAnsi"/>
-        </w:rPr>
-        <w:t>și</w:t>
-      </w:r>
-      <w:proofErr w:type="spellEnd"/>
-      <w:r>
-        <w:rPr>
-          <w:rFonts w:cstheme="minorHAnsi"/>
-        </w:rPr>
-        <w:t xml:space="preserve"> </w:t>
-      </w:r>
-      <w:proofErr w:type="spellStart"/>
-      <w:r>
-        <w:rPr>
-          <w:rFonts w:cstheme="minorHAnsi"/>
-        </w:rPr>
-        <w:t>categorii</w:t>
-      </w:r>
-      <w:proofErr w:type="spellEnd"/>
-      <w:r>
-        <w:rPr>
-          <w:rFonts w:cstheme="minorHAnsi"/>
-        </w:rPr>
-        <w:t xml:space="preserve"> de </w:t>
-      </w:r>
-      <w:proofErr w:type="spellStart"/>
-      <w:r>
-        <w:rPr>
-          <w:rFonts w:cstheme="minorHAnsi"/>
-        </w:rPr>
-        <w:t>băuturi</w:t>
-      </w:r>
-      <w:proofErr w:type="spellEnd"/>
-      <w:r>
-        <w:rPr>
-          <w:rFonts w:cstheme="minorHAnsi"/>
-        </w:rPr>
-        <w:t>.</w:t>
+          <w:lang w:val="ro-RO"/>
+        </w:rPr>
+      </w:pPr>
+      <w:r>
+        <w:rPr>
+          <w:rFonts w:cstheme="minorHAnsi"/>
+          <w:b/>
+          <w:bCs/>
+          <w:lang w:val="ro-RO"/>
+        </w:rPr>
+        <w:t>Nu se face login/ utilizatorii sunt doar vânzătorii.</w:t>
       </w:r>
     </w:p>
     <w:p>
@@ -1683,119 +436,41 @@
         <w:jc w:val="both"/>
         <w:rPr>
           <w:rFonts w:cstheme="minorHAnsi"/>
-        </w:rPr>
-      </w:pPr>
-      <w:proofErr w:type="spellStart"/>
-      <w:r>
-        <w:rPr>
-          <w:rFonts w:cstheme="minorHAnsi"/>
-        </w:rPr>
-        <w:t>Aplicația</w:t>
-      </w:r>
-      <w:proofErr w:type="spellEnd"/>
-      <w:r>
-        <w:rPr>
-          <w:rFonts w:cstheme="minorHAnsi"/>
-        </w:rPr>
-        <w:t xml:space="preserve"> </w:t>
-      </w:r>
-      <w:proofErr w:type="spellStart"/>
-      <w:r>
-        <w:rPr>
-          <w:rFonts w:cstheme="minorHAnsi"/>
-        </w:rPr>
-        <w:t>trebuie</w:t>
-      </w:r>
-      <w:proofErr w:type="spellEnd"/>
-      <w:r>
-        <w:rPr>
-          <w:rFonts w:cstheme="minorHAnsi"/>
-        </w:rPr>
-        <w:t xml:space="preserve"> </w:t>
-      </w:r>
-      <w:proofErr w:type="spellStart"/>
-      <w:r>
-        <w:rPr>
-          <w:rFonts w:cstheme="minorHAnsi"/>
-        </w:rPr>
-        <w:t>să</w:t>
-      </w:r>
-      <w:proofErr w:type="spellEnd"/>
-      <w:r>
-        <w:rPr>
-          <w:rFonts w:cstheme="minorHAnsi"/>
-        </w:rPr>
-        <w:t xml:space="preserve"> </w:t>
-      </w:r>
-      <w:proofErr w:type="spellStart"/>
-      <w:r>
-        <w:rPr>
-          <w:rFonts w:cstheme="minorHAnsi"/>
-        </w:rPr>
-        <w:t>permită</w:t>
-      </w:r>
-      <w:proofErr w:type="spellEnd"/>
-      <w:r>
-        <w:rPr>
-          <w:rFonts w:cstheme="minorHAnsi"/>
-        </w:rPr>
-        <w:t xml:space="preserve"> </w:t>
-      </w:r>
-      <w:proofErr w:type="spellStart"/>
-      <w:r>
-        <w:rPr>
-          <w:rFonts w:cstheme="minorHAnsi"/>
-        </w:rPr>
-        <w:t>definirea</w:t>
-      </w:r>
-      <w:proofErr w:type="spellEnd"/>
-      <w:r>
-        <w:rPr>
-          <w:rFonts w:cstheme="minorHAnsi"/>
-        </w:rPr>
-        <w:t xml:space="preserve"> </w:t>
-      </w:r>
-      <w:proofErr w:type="spellStart"/>
-      <w:r>
-        <w:rPr>
-          <w:rFonts w:cstheme="minorHAnsi"/>
-        </w:rPr>
-        <w:t>rețetelor</w:t>
-      </w:r>
-      <w:proofErr w:type="spellEnd"/>
-      <w:r>
-        <w:rPr>
-          <w:rFonts w:cstheme="minorHAnsi"/>
-        </w:rPr>
-        <w:t xml:space="preserve"> </w:t>
-      </w:r>
-      <w:proofErr w:type="spellStart"/>
-      <w:r>
-        <w:rPr>
-          <w:rFonts w:cstheme="minorHAnsi"/>
-        </w:rPr>
-        <w:t>pentru</w:t>
-      </w:r>
-      <w:proofErr w:type="spellEnd"/>
-      <w:r>
-        <w:rPr>
-          <w:rFonts w:cstheme="minorHAnsi"/>
-        </w:rPr>
-        <w:t xml:space="preserve"> </w:t>
-      </w:r>
-      <w:proofErr w:type="spellStart"/>
-      <w:r>
-        <w:rPr>
-          <w:rFonts w:cstheme="minorHAnsi"/>
-        </w:rPr>
-        <w:t>produse</w:t>
-      </w:r>
-      <w:proofErr w:type="spellEnd"/>
-      <w:r>
-        <w:rPr>
-          <w:rFonts w:cstheme="minorHAnsi"/>
-        </w:rPr>
-        <w:t>:</w:t>
+          <w:lang w:val="ro-RO"/>
+        </w:rPr>
+      </w:pPr>
+      <w:r>
+        <w:rPr>
+          <w:rFonts w:cstheme="minorHAnsi"/>
+          <w:lang w:val="ro-RO"/>
+        </w:rPr>
+        <w:t>Utilizatorul poate adăuga, modifica și șterge tipuri și categorii de băuturi.</w:t>
+      </w:r>
+    </w:p>
+    <w:p>
+      <w:pPr>
+        <w:widowControl w:val="0"/>
+        <w:numPr>
+          <w:ilvl w:val="0"/>
+          <w:numId w:val="22"/>
+        </w:numPr>
+        <w:autoSpaceDE w:val="0"/>
+        <w:autoSpaceDN w:val="0"/>
+        <w:adjustRightInd w:val="0"/>
+        <w:spacing w:after="0" w:line="240" w:lineRule="auto"/>
+        <w:ind w:right="75"/>
+        <w:jc w:val="both"/>
+        <w:rPr>
+          <w:rFonts w:cstheme="minorHAnsi"/>
+          <w:lang w:val="ro-RO"/>
+        </w:rPr>
+      </w:pPr>
+      <w:r>
+        <w:rPr>
+          <w:rFonts w:cstheme="minorHAnsi"/>
+          <w:lang w:val="ro-RO"/>
+        </w:rPr>
+        <w:t>Aplicația trebuie să permită definirea rețetelor pentru produse:</w:t>
       </w:r>
     </w:p>
     <w:p>
@@ -1813,105 +488,15 @@
         <w:jc w:val="both"/>
         <w:rPr>
           <w:rFonts w:cstheme="minorHAnsi"/>
-        </w:rPr>
-      </w:pPr>
-      <w:proofErr w:type="spellStart"/>
-      <w:r>
-        <w:rPr>
-          <w:rFonts w:cstheme="minorHAnsi"/>
-        </w:rPr>
-        <w:t>fiecare</w:t>
-      </w:r>
-      <w:proofErr w:type="spellEnd"/>
-      <w:r>
-        <w:rPr>
-          <w:rFonts w:cstheme="minorHAnsi"/>
-        </w:rPr>
-        <w:t xml:space="preserve"> </w:t>
-      </w:r>
-      <w:proofErr w:type="spellStart"/>
-      <w:r>
-        <w:rPr>
-          <w:rFonts w:cstheme="minorHAnsi"/>
-        </w:rPr>
-        <w:t>rețetă</w:t>
-      </w:r>
-      <w:proofErr w:type="spellEnd"/>
-      <w:r>
-        <w:rPr>
-          <w:rFonts w:cstheme="minorHAnsi"/>
-        </w:rPr>
-        <w:t xml:space="preserve"> </w:t>
-      </w:r>
-      <w:proofErr w:type="spellStart"/>
-      <w:r>
-        <w:rPr>
-          <w:rFonts w:cstheme="minorHAnsi"/>
-        </w:rPr>
-        <w:t>este</w:t>
-      </w:r>
-      <w:proofErr w:type="spellEnd"/>
-      <w:r>
-        <w:rPr>
-          <w:rFonts w:cstheme="minorHAnsi"/>
-        </w:rPr>
-        <w:t xml:space="preserve"> </w:t>
-      </w:r>
-      <w:proofErr w:type="spellStart"/>
-      <w:r>
-        <w:rPr>
-          <w:rFonts w:cstheme="minorHAnsi"/>
-        </w:rPr>
-        <w:t>compusă</w:t>
-      </w:r>
-      <w:proofErr w:type="spellEnd"/>
-      <w:r>
-        <w:rPr>
-          <w:rFonts w:cstheme="minorHAnsi"/>
-        </w:rPr>
-        <w:t xml:space="preserve"> din </w:t>
-      </w:r>
-      <w:proofErr w:type="spellStart"/>
-      <w:r>
-        <w:rPr>
-          <w:rFonts w:cstheme="minorHAnsi"/>
-        </w:rPr>
-        <w:t>mai</w:t>
-      </w:r>
-      <w:proofErr w:type="spellEnd"/>
-      <w:r>
-        <w:rPr>
-          <w:rFonts w:cstheme="minorHAnsi"/>
-        </w:rPr>
-        <w:t xml:space="preserve"> </w:t>
-      </w:r>
-      <w:proofErr w:type="spellStart"/>
-      <w:r>
-        <w:rPr>
-          <w:rFonts w:cstheme="minorHAnsi"/>
-        </w:rPr>
-        <w:t>multe</w:t>
-      </w:r>
-      <w:proofErr w:type="spellEnd"/>
-      <w:r>
-        <w:rPr>
-          <w:rFonts w:cstheme="minorHAnsi"/>
-        </w:rPr>
-        <w:t xml:space="preserve"> </w:t>
-      </w:r>
-      <w:proofErr w:type="spellStart"/>
-      <w:r>
-        <w:rPr>
-          <w:rFonts w:cstheme="minorHAnsi"/>
-        </w:rPr>
-        <w:t>ingrediente</w:t>
-      </w:r>
-      <w:proofErr w:type="spellEnd"/>
-      <w:r>
-        <w:rPr>
-          <w:rFonts w:cstheme="minorHAnsi"/>
-        </w:rPr>
-        <w:t>;</w:t>
+          <w:lang w:val="ro-RO"/>
+        </w:rPr>
+      </w:pPr>
+      <w:r>
+        <w:rPr>
+          <w:rFonts w:cstheme="minorHAnsi"/>
+          <w:lang w:val="ro-RO"/>
+        </w:rPr>
+        <w:t>fiecare rețetă este compusă din mai multe ingrediente;</w:t>
       </w:r>
     </w:p>
     <w:p>
@@ -1929,63 +514,71 @@
         <w:jc w:val="both"/>
         <w:rPr>
           <w:rFonts w:cstheme="minorHAnsi"/>
-        </w:rPr>
-      </w:pPr>
-      <w:proofErr w:type="spellStart"/>
-      <w:r>
-        <w:rPr>
-          <w:rFonts w:cstheme="minorHAnsi"/>
-        </w:rPr>
-        <w:t>pentru</w:t>
-      </w:r>
-      <w:proofErr w:type="spellEnd"/>
-      <w:r>
-        <w:rPr>
-          <w:rFonts w:cstheme="minorHAnsi"/>
-        </w:rPr>
-        <w:t xml:space="preserve"> </w:t>
-      </w:r>
-      <w:proofErr w:type="spellStart"/>
-      <w:r>
-        <w:rPr>
-          <w:rFonts w:cstheme="minorHAnsi"/>
-        </w:rPr>
-        <w:t>fiecare</w:t>
-      </w:r>
-      <w:proofErr w:type="spellEnd"/>
-      <w:r>
-        <w:rPr>
-          <w:rFonts w:cstheme="minorHAnsi"/>
-        </w:rPr>
-        <w:t xml:space="preserve"> ingredient se </w:t>
-      </w:r>
-      <w:proofErr w:type="spellStart"/>
-      <w:r>
-        <w:rPr>
-          <w:rFonts w:cstheme="minorHAnsi"/>
-        </w:rPr>
-        <w:t>specifică</w:t>
-      </w:r>
-      <w:proofErr w:type="spellEnd"/>
-      <w:r>
-        <w:rPr>
-          <w:rFonts w:cstheme="minorHAnsi"/>
-        </w:rPr>
-        <w:t xml:space="preserve"> o </w:t>
-      </w:r>
-      <w:proofErr w:type="spellStart"/>
-      <w:r>
-        <w:rPr>
-          <w:rFonts w:cstheme="minorHAnsi"/>
-        </w:rPr>
-        <w:t>cantitate</w:t>
-      </w:r>
-      <w:proofErr w:type="spellEnd"/>
-      <w:r>
-        <w:rPr>
-          <w:rFonts w:cstheme="minorHAnsi"/>
-        </w:rPr>
-        <w:t>.</w:t>
+          <w:lang w:val="ro-RO"/>
+        </w:rPr>
+      </w:pPr>
+      <w:r>
+        <w:rPr>
+          <w:rFonts w:cstheme="minorHAnsi"/>
+          <w:lang w:val="ro-RO"/>
+        </w:rPr>
+        <w:t>pentru fiecare ingredient se specifică o cantitate.</w:t>
+      </w:r>
+    </w:p>
+    <w:p>
+      <w:pPr>
+        <w:widowControl w:val="0"/>
+        <w:numPr>
+          <w:ilvl w:val="1"/>
+          <w:numId w:val="22"/>
+        </w:numPr>
+        <w:autoSpaceDE w:val="0"/>
+        <w:autoSpaceDN w:val="0"/>
+        <w:adjustRightInd w:val="0"/>
+        <w:spacing w:after="0" w:line="240" w:lineRule="auto"/>
+        <w:ind w:right="75"/>
+        <w:jc w:val="both"/>
+        <w:rPr>
+          <w:rFonts w:cstheme="minorHAnsi"/>
+          <w:lang w:val="ro-RO"/>
+        </w:rPr>
+      </w:pPr>
+      <w:r>
+        <w:rPr>
+          <w:rFonts w:cstheme="minorHAnsi"/>
+          <w:b/>
+          <w:bCs/>
+          <w:lang w:val="ro-RO"/>
+        </w:rPr>
+        <w:t>Vizualizarea comenzilor</w:t>
+      </w:r>
+    </w:p>
+    <w:p>
+      <w:pPr>
+        <w:widowControl w:val="0"/>
+        <w:numPr>
+          <w:ilvl w:val="1"/>
+          <w:numId w:val="22"/>
+        </w:numPr>
+        <w:autoSpaceDE w:val="0"/>
+        <w:autoSpaceDN w:val="0"/>
+        <w:adjustRightInd w:val="0"/>
+        <w:spacing w:after="0" w:line="240" w:lineRule="auto"/>
+        <w:ind w:right="75"/>
+        <w:jc w:val="both"/>
+        <w:rPr>
+          <w:rFonts w:cstheme="minorHAnsi"/>
+          <w:lang w:val="ro-RO"/>
+        </w:rPr>
+      </w:pPr>
+      <w:r>
+        <w:rPr>
+          <w:rFonts w:cstheme="minorHAnsi"/>
+          <w:b/>
+          <w:bCs/>
+          <w:lang w:val="ro-RO"/>
+        </w:rPr>
+        <w:t>Dacă nu sunt destule stocuri, rețeta nu se poate face (se afișează mesaj de eroare).</w:t>
       </w:r>
     </w:p>
     <w:p>
@@ -2003,91 +596,15 @@
         <w:jc w:val="both"/>
         <w:rPr>
           <w:rFonts w:cstheme="minorHAnsi"/>
-        </w:rPr>
-      </w:pPr>
-      <w:proofErr w:type="spellStart"/>
-      <w:r>
-        <w:rPr>
-          <w:rFonts w:cstheme="minorHAnsi"/>
-        </w:rPr>
-        <w:t>Aplicația</w:t>
-      </w:r>
-      <w:proofErr w:type="spellEnd"/>
-      <w:r>
-        <w:rPr>
-          <w:rFonts w:cstheme="minorHAnsi"/>
-        </w:rPr>
-        <w:t xml:space="preserve"> </w:t>
-      </w:r>
-      <w:proofErr w:type="spellStart"/>
-      <w:r>
-        <w:rPr>
-          <w:rFonts w:cstheme="minorHAnsi"/>
-        </w:rPr>
-        <w:t>trebuie</w:t>
-      </w:r>
-      <w:proofErr w:type="spellEnd"/>
-      <w:r>
-        <w:rPr>
-          <w:rFonts w:cstheme="minorHAnsi"/>
-        </w:rPr>
-        <w:t xml:space="preserve"> </w:t>
-      </w:r>
-      <w:proofErr w:type="spellStart"/>
-      <w:r>
-        <w:rPr>
-          <w:rFonts w:cstheme="minorHAnsi"/>
-        </w:rPr>
-        <w:t>să</w:t>
-      </w:r>
-      <w:proofErr w:type="spellEnd"/>
-      <w:r>
-        <w:rPr>
-          <w:rFonts w:cstheme="minorHAnsi"/>
-        </w:rPr>
-        <w:t xml:space="preserve"> </w:t>
-      </w:r>
-      <w:proofErr w:type="spellStart"/>
-      <w:r>
-        <w:rPr>
-          <w:rFonts w:cstheme="minorHAnsi"/>
-        </w:rPr>
-        <w:t>gestioneze</w:t>
-      </w:r>
-      <w:proofErr w:type="spellEnd"/>
-      <w:r>
-        <w:rPr>
-          <w:rFonts w:cstheme="minorHAnsi"/>
-        </w:rPr>
-        <w:t xml:space="preserve"> </w:t>
-      </w:r>
-      <w:proofErr w:type="spellStart"/>
-      <w:r>
-        <w:rPr>
-          <w:rFonts w:cstheme="minorHAnsi"/>
-        </w:rPr>
-        <w:t>stocurile</w:t>
-      </w:r>
-      <w:proofErr w:type="spellEnd"/>
-      <w:r>
-        <w:rPr>
-          <w:rFonts w:cstheme="minorHAnsi"/>
-        </w:rPr>
-        <w:t xml:space="preserve"> de </w:t>
-      </w:r>
-      <w:proofErr w:type="spellStart"/>
-      <w:r>
-        <w:rPr>
-          <w:rFonts w:cstheme="minorHAnsi"/>
-        </w:rPr>
-        <w:t>ingrediente</w:t>
-      </w:r>
-      <w:proofErr w:type="spellEnd"/>
-      <w:r>
-        <w:rPr>
-          <w:rFonts w:cstheme="minorHAnsi"/>
-        </w:rPr>
-        <w:t>:</w:t>
+          <w:lang w:val="ro-RO"/>
+        </w:rPr>
+      </w:pPr>
+      <w:r>
+        <w:rPr>
+          <w:rFonts w:cstheme="minorHAnsi"/>
+          <w:lang w:val="ro-RO"/>
+        </w:rPr>
+        <w:t>Aplicația trebuie să gestioneze stocurile de ingrediente:</w:t>
       </w:r>
     </w:p>
     <w:p>
@@ -2105,49 +622,15 @@
         <w:jc w:val="both"/>
         <w:rPr>
           <w:rFonts w:cstheme="minorHAnsi"/>
-        </w:rPr>
-      </w:pPr>
-      <w:proofErr w:type="spellStart"/>
-      <w:r>
-        <w:rPr>
-          <w:rFonts w:cstheme="minorHAnsi"/>
-        </w:rPr>
-        <w:t>afișarea</w:t>
-      </w:r>
-      <w:proofErr w:type="spellEnd"/>
-      <w:r>
-        <w:rPr>
-          <w:rFonts w:cstheme="minorHAnsi"/>
-        </w:rPr>
-        <w:t xml:space="preserve"> </w:t>
-      </w:r>
-      <w:proofErr w:type="spellStart"/>
-      <w:r>
-        <w:rPr>
-          <w:rFonts w:cstheme="minorHAnsi"/>
-        </w:rPr>
-        <w:t>cantității</w:t>
-      </w:r>
-      <w:proofErr w:type="spellEnd"/>
-      <w:r>
-        <w:rPr>
-          <w:rFonts w:cstheme="minorHAnsi"/>
-        </w:rPr>
-        <w:t xml:space="preserve"> </w:t>
-      </w:r>
-      <w:proofErr w:type="spellStart"/>
-      <w:r>
-        <w:rPr>
-          <w:rFonts w:cstheme="minorHAnsi"/>
-        </w:rPr>
-        <w:t>disponibile</w:t>
-      </w:r>
-      <w:proofErr w:type="spellEnd"/>
-      <w:r>
-        <w:rPr>
-          <w:rFonts w:cstheme="minorHAnsi"/>
-        </w:rPr>
-        <w:t>;</w:t>
+          <w:lang w:val="ro-RO"/>
+        </w:rPr>
+      </w:pPr>
+      <w:r>
+        <w:rPr>
+          <w:rFonts w:cstheme="minorHAnsi"/>
+          <w:lang w:val="ro-RO"/>
+        </w:rPr>
+        <w:t>afișarea cantității disponibile;</w:t>
       </w:r>
     </w:p>
     <w:p>
@@ -2165,77 +648,71 @@
         <w:jc w:val="both"/>
         <w:rPr>
           <w:rFonts w:cstheme="minorHAnsi"/>
-        </w:rPr>
-      </w:pPr>
-      <w:proofErr w:type="spellStart"/>
-      <w:r>
-        <w:rPr>
-          <w:rFonts w:cstheme="minorHAnsi"/>
-        </w:rPr>
-        <w:t>actualizarea</w:t>
-      </w:r>
-      <w:proofErr w:type="spellEnd"/>
-      <w:r>
-        <w:rPr>
-          <w:rFonts w:cstheme="minorHAnsi"/>
-        </w:rPr>
-        <w:t xml:space="preserve"> </w:t>
-      </w:r>
-      <w:proofErr w:type="spellStart"/>
-      <w:r>
-        <w:rPr>
-          <w:rFonts w:cstheme="minorHAnsi"/>
-        </w:rPr>
-        <w:t>stocului</w:t>
-      </w:r>
-      <w:proofErr w:type="spellEnd"/>
-      <w:r>
-        <w:rPr>
-          <w:rFonts w:cstheme="minorHAnsi"/>
-        </w:rPr>
-        <w:t xml:space="preserve"> </w:t>
-      </w:r>
-      <w:proofErr w:type="spellStart"/>
-      <w:r>
-        <w:rPr>
-          <w:rFonts w:cstheme="minorHAnsi"/>
-        </w:rPr>
-        <w:t>în</w:t>
-      </w:r>
-      <w:proofErr w:type="spellEnd"/>
-      <w:r>
-        <w:rPr>
-          <w:rFonts w:cstheme="minorHAnsi"/>
-        </w:rPr>
-        <w:t xml:space="preserve"> </w:t>
-      </w:r>
-      <w:proofErr w:type="spellStart"/>
-      <w:r>
-        <w:rPr>
-          <w:rFonts w:cstheme="minorHAnsi"/>
-        </w:rPr>
-        <w:t>urma</w:t>
-      </w:r>
-      <w:proofErr w:type="spellEnd"/>
-      <w:r>
-        <w:rPr>
-          <w:rFonts w:cstheme="minorHAnsi"/>
-        </w:rPr>
-        <w:t xml:space="preserve"> </w:t>
-      </w:r>
-      <w:proofErr w:type="spellStart"/>
-      <w:r>
-        <w:rPr>
-          <w:rFonts w:cstheme="minorHAnsi"/>
-        </w:rPr>
-        <w:t>comenzilor</w:t>
-      </w:r>
-      <w:proofErr w:type="spellEnd"/>
-      <w:r>
-        <w:rPr>
-          <w:rFonts w:cstheme="minorHAnsi"/>
-        </w:rPr>
-        <w:t>.</w:t>
+          <w:lang w:val="ro-RO"/>
+        </w:rPr>
+      </w:pPr>
+      <w:r>
+        <w:rPr>
+          <w:rFonts w:cstheme="minorHAnsi"/>
+          <w:lang w:val="ro-RO"/>
+        </w:rPr>
+        <w:t>actualizarea stocului în urma comenzilor.</w:t>
+      </w:r>
+    </w:p>
+    <w:p>
+      <w:pPr>
+        <w:widowControl w:val="0"/>
+        <w:numPr>
+          <w:ilvl w:val="1"/>
+          <w:numId w:val="22"/>
+        </w:numPr>
+        <w:autoSpaceDE w:val="0"/>
+        <w:autoSpaceDN w:val="0"/>
+        <w:adjustRightInd w:val="0"/>
+        <w:spacing w:after="0" w:line="240" w:lineRule="auto"/>
+        <w:ind w:right="75"/>
+        <w:jc w:val="both"/>
+        <w:rPr>
+          <w:rFonts w:cstheme="minorHAnsi"/>
+          <w:lang w:val="ro-RO"/>
+        </w:rPr>
+      </w:pPr>
+      <w:r>
+        <w:rPr>
+          <w:rFonts w:cstheme="minorHAnsi"/>
+          <w:b/>
+          <w:bCs/>
+          <w:lang w:val="ro-RO"/>
+        </w:rPr>
+        <w:t>Actualizarea stocului când se primește marfă.</w:t>
+      </w:r>
+    </w:p>
+    <w:p>
+      <w:pPr>
+        <w:widowControl w:val="0"/>
+        <w:numPr>
+          <w:ilvl w:val="1"/>
+          <w:numId w:val="22"/>
+        </w:numPr>
+        <w:autoSpaceDE w:val="0"/>
+        <w:autoSpaceDN w:val="0"/>
+        <w:adjustRightInd w:val="0"/>
+        <w:spacing w:after="0" w:line="240" w:lineRule="auto"/>
+        <w:ind w:right="75"/>
+        <w:jc w:val="both"/>
+        <w:rPr>
+          <w:rFonts w:cstheme="minorHAnsi"/>
+          <w:lang w:val="ro-RO"/>
+        </w:rPr>
+      </w:pPr>
+      <w:r>
+        <w:rPr>
+          <w:rFonts w:cstheme="minorHAnsi"/>
+          <w:b/>
+          <w:bCs/>
+          <w:lang w:val="ro-RO"/>
+        </w:rPr>
+        <w:t>Afișarea unui mesaj de eroare, când stocul este gol.</w:t>
       </w:r>
     </w:p>
     <w:p>
@@ -2253,91 +730,15 @@
         <w:jc w:val="both"/>
         <w:rPr>
           <w:rFonts w:cstheme="minorHAnsi"/>
-        </w:rPr>
-      </w:pPr>
-      <w:proofErr w:type="spellStart"/>
-      <w:r>
-        <w:rPr>
-          <w:rFonts w:cstheme="minorHAnsi"/>
-        </w:rPr>
-        <w:t>Aplicația</w:t>
-      </w:r>
-      <w:proofErr w:type="spellEnd"/>
-      <w:r>
-        <w:rPr>
-          <w:rFonts w:cstheme="minorHAnsi"/>
-        </w:rPr>
-        <w:t xml:space="preserve"> </w:t>
-      </w:r>
-      <w:proofErr w:type="spellStart"/>
-      <w:r>
-        <w:rPr>
-          <w:rFonts w:cstheme="minorHAnsi"/>
-        </w:rPr>
-        <w:t>trebuie</w:t>
-      </w:r>
-      <w:proofErr w:type="spellEnd"/>
-      <w:r>
-        <w:rPr>
-          <w:rFonts w:cstheme="minorHAnsi"/>
-        </w:rPr>
-        <w:t xml:space="preserve"> </w:t>
-      </w:r>
-      <w:proofErr w:type="spellStart"/>
-      <w:r>
-        <w:rPr>
-          <w:rFonts w:cstheme="minorHAnsi"/>
-        </w:rPr>
-        <w:t>să</w:t>
-      </w:r>
-      <w:proofErr w:type="spellEnd"/>
-      <w:r>
-        <w:rPr>
-          <w:rFonts w:cstheme="minorHAnsi"/>
-        </w:rPr>
-        <w:t xml:space="preserve"> </w:t>
-      </w:r>
-      <w:proofErr w:type="spellStart"/>
-      <w:r>
-        <w:rPr>
-          <w:rFonts w:cstheme="minorHAnsi"/>
-        </w:rPr>
-        <w:t>permită</w:t>
-      </w:r>
-      <w:proofErr w:type="spellEnd"/>
-      <w:r>
-        <w:rPr>
-          <w:rFonts w:cstheme="minorHAnsi"/>
-        </w:rPr>
-        <w:t xml:space="preserve"> </w:t>
-      </w:r>
-      <w:proofErr w:type="spellStart"/>
-      <w:r>
-        <w:rPr>
-          <w:rFonts w:cstheme="minorHAnsi"/>
-        </w:rPr>
-        <w:t>crearea</w:t>
-      </w:r>
-      <w:proofErr w:type="spellEnd"/>
-      <w:r>
-        <w:rPr>
-          <w:rFonts w:cstheme="minorHAnsi"/>
-        </w:rPr>
-        <w:t xml:space="preserve"> </w:t>
-      </w:r>
-      <w:proofErr w:type="spellStart"/>
-      <w:r>
-        <w:rPr>
-          <w:rFonts w:cstheme="minorHAnsi"/>
-        </w:rPr>
-        <w:t>comenzilor</w:t>
-      </w:r>
-      <w:proofErr w:type="spellEnd"/>
-      <w:r>
-        <w:rPr>
-          <w:rFonts w:cstheme="minorHAnsi"/>
-        </w:rPr>
-        <w:t>:</w:t>
+          <w:lang w:val="ro-RO"/>
+        </w:rPr>
+      </w:pPr>
+      <w:r>
+        <w:rPr>
+          <w:rFonts w:cstheme="minorHAnsi"/>
+          <w:lang w:val="ro-RO"/>
+        </w:rPr>
+        <w:t>Aplicația trebuie să permită crearea comenzilor:</w:t>
       </w:r>
     </w:p>
     <w:p>
@@ -2355,111 +756,15 @@
         <w:jc w:val="both"/>
         <w:rPr>
           <w:rFonts w:cstheme="minorHAnsi"/>
-        </w:rPr>
-      </w:pPr>
-      <w:r>
-        <w:rPr>
-          <w:rFonts w:cstheme="minorHAnsi"/>
-        </w:rPr>
-        <w:t xml:space="preserve">o </w:t>
-      </w:r>
-      <w:proofErr w:type="spellStart"/>
-      <w:r>
-        <w:rPr>
-          <w:rFonts w:cstheme="minorHAnsi"/>
-        </w:rPr>
-        <w:t>comandă</w:t>
-      </w:r>
-      <w:proofErr w:type="spellEnd"/>
-      <w:r>
-        <w:rPr>
-          <w:rFonts w:cstheme="minorHAnsi"/>
-        </w:rPr>
-        <w:t xml:space="preserve"> </w:t>
-      </w:r>
-      <w:proofErr w:type="spellStart"/>
-      <w:r>
-        <w:rPr>
-          <w:rFonts w:cstheme="minorHAnsi"/>
-        </w:rPr>
-        <w:t>conține</w:t>
-      </w:r>
-      <w:proofErr w:type="spellEnd"/>
-      <w:r>
-        <w:rPr>
-          <w:rFonts w:cstheme="minorHAnsi"/>
-        </w:rPr>
-        <w:t xml:space="preserve"> </w:t>
-      </w:r>
-      <w:proofErr w:type="spellStart"/>
-      <w:r>
-        <w:rPr>
-          <w:rFonts w:cstheme="minorHAnsi"/>
-        </w:rPr>
-        <w:t>unul</w:t>
-      </w:r>
-      <w:proofErr w:type="spellEnd"/>
-      <w:r>
-        <w:rPr>
-          <w:rFonts w:cstheme="minorHAnsi"/>
-        </w:rPr>
-        <w:t xml:space="preserve"> </w:t>
-      </w:r>
-      <w:proofErr w:type="spellStart"/>
-      <w:r>
-        <w:rPr>
-          <w:rFonts w:cstheme="minorHAnsi"/>
-        </w:rPr>
-        <w:t>sau</w:t>
-      </w:r>
-      <w:proofErr w:type="spellEnd"/>
-      <w:r>
-        <w:rPr>
-          <w:rFonts w:cstheme="minorHAnsi"/>
-        </w:rPr>
-        <w:t xml:space="preserve"> </w:t>
-      </w:r>
-      <w:proofErr w:type="spellStart"/>
-      <w:r>
-        <w:rPr>
-          <w:rFonts w:cstheme="minorHAnsi"/>
-        </w:rPr>
-        <w:t>mai</w:t>
-      </w:r>
-      <w:proofErr w:type="spellEnd"/>
-      <w:r>
-        <w:rPr>
-          <w:rFonts w:cstheme="minorHAnsi"/>
-        </w:rPr>
-        <w:t xml:space="preserve"> </w:t>
-      </w:r>
-      <w:proofErr w:type="spellStart"/>
-      <w:r>
-        <w:rPr>
-          <w:rFonts w:cstheme="minorHAnsi"/>
-        </w:rPr>
-        <w:t>multe</w:t>
-      </w:r>
-      <w:proofErr w:type="spellEnd"/>
-      <w:r>
-        <w:rPr>
-          <w:rFonts w:cstheme="minorHAnsi"/>
-        </w:rPr>
-        <w:t xml:space="preserve"> </w:t>
-      </w:r>
-      <w:proofErr w:type="spellStart"/>
-      <w:r>
-        <w:rPr>
-          <w:rFonts w:cstheme="minorHAnsi"/>
-        </w:rPr>
-        <w:t>produse</w:t>
-      </w:r>
-      <w:proofErr w:type="spellEnd"/>
-      <w:r>
-        <w:rPr>
-          <w:rFonts w:cstheme="minorHAnsi"/>
-        </w:rPr>
-        <w:t>;</w:t>
+          <w:lang w:val="ro-RO"/>
+        </w:rPr>
+      </w:pPr>
+      <w:r>
+        <w:rPr>
+          <w:rFonts w:cstheme="minorHAnsi"/>
+          <w:lang w:val="ro-RO"/>
+        </w:rPr>
+        <w:t>o comandă conține unul sau mai multe produse;</w:t>
       </w:r>
     </w:p>
     <w:p>
@@ -2477,63 +782,43 @@
         <w:jc w:val="both"/>
         <w:rPr>
           <w:rFonts w:cstheme="minorHAnsi"/>
-        </w:rPr>
-      </w:pPr>
-      <w:proofErr w:type="spellStart"/>
-      <w:r>
-        <w:rPr>
-          <w:rFonts w:cstheme="minorHAnsi"/>
-        </w:rPr>
-        <w:t>fiecare</w:t>
-      </w:r>
-      <w:proofErr w:type="spellEnd"/>
-      <w:r>
-        <w:rPr>
-          <w:rFonts w:cstheme="minorHAnsi"/>
-        </w:rPr>
-        <w:t xml:space="preserve"> </w:t>
-      </w:r>
-      <w:proofErr w:type="spellStart"/>
-      <w:r>
-        <w:rPr>
-          <w:rFonts w:cstheme="minorHAnsi"/>
-        </w:rPr>
-        <w:t>produs</w:t>
-      </w:r>
-      <w:proofErr w:type="spellEnd"/>
-      <w:r>
-        <w:rPr>
-          <w:rFonts w:cstheme="minorHAnsi"/>
-        </w:rPr>
-        <w:t xml:space="preserve"> are </w:t>
-      </w:r>
-      <w:proofErr w:type="spellStart"/>
-      <w:r>
-        <w:rPr>
-          <w:rFonts w:cstheme="minorHAnsi"/>
-        </w:rPr>
-        <w:t>asociată</w:t>
-      </w:r>
-      <w:proofErr w:type="spellEnd"/>
-      <w:r>
-        <w:rPr>
-          <w:rFonts w:cstheme="minorHAnsi"/>
-        </w:rPr>
-        <w:t xml:space="preserve"> o </w:t>
-      </w:r>
-      <w:proofErr w:type="spellStart"/>
-      <w:r>
-        <w:rPr>
-          <w:rFonts w:cstheme="minorHAnsi"/>
-        </w:rPr>
-        <w:t>cantitate</w:t>
-      </w:r>
-      <w:proofErr w:type="spellEnd"/>
-      <w:r>
-        <w:rPr>
-          <w:rFonts w:cstheme="minorHAnsi"/>
-        </w:rPr>
-        <w:t>.</w:t>
+          <w:lang w:val="ro-RO"/>
+        </w:rPr>
+      </w:pPr>
+      <w:r>
+        <w:rPr>
+          <w:rFonts w:cstheme="minorHAnsi"/>
+          <w:lang w:val="ro-RO"/>
+        </w:rPr>
+        <w:t>fiecare produs are asociată o cantitate.</w:t>
+      </w:r>
+    </w:p>
+    <w:p>
+      <w:pPr>
+        <w:widowControl w:val="0"/>
+        <w:numPr>
+          <w:ilvl w:val="1"/>
+          <w:numId w:val="22"/>
+        </w:numPr>
+        <w:autoSpaceDE w:val="0"/>
+        <w:autoSpaceDN w:val="0"/>
+        <w:adjustRightInd w:val="0"/>
+        <w:spacing w:after="0" w:line="240" w:lineRule="auto"/>
+        <w:ind w:right="75"/>
+        <w:jc w:val="both"/>
+        <w:rPr>
+          <w:rFonts w:cstheme="minorHAnsi"/>
+          <w:lang w:val="ro-RO"/>
+        </w:rPr>
+      </w:pPr>
+      <w:r>
+        <w:rPr>
+          <w:rFonts w:cstheme="minorHAnsi"/>
+          <w:b/>
+          <w:bCs/>
+          <w:lang w:val="ro-RO"/>
+        </w:rPr>
+        <w:t>Finalizarea unei comenzi se realizează printr-un buton de plasare al comenzii.</w:t>
       </w:r>
     </w:p>
     <w:p>
@@ -2551,147 +836,15 @@
         <w:jc w:val="both"/>
         <w:rPr>
           <w:rFonts w:cstheme="minorHAnsi"/>
-        </w:rPr>
-      </w:pPr>
-      <w:proofErr w:type="spellStart"/>
-      <w:r>
-        <w:rPr>
-          <w:rFonts w:cstheme="minorHAnsi"/>
-        </w:rPr>
-        <w:t>Aplicația</w:t>
-      </w:r>
-      <w:proofErr w:type="spellEnd"/>
-      <w:r>
-        <w:rPr>
-          <w:rFonts w:cstheme="minorHAnsi"/>
-        </w:rPr>
-        <w:t xml:space="preserve"> </w:t>
-      </w:r>
-      <w:proofErr w:type="spellStart"/>
-      <w:r>
-        <w:rPr>
-          <w:rFonts w:cstheme="minorHAnsi"/>
-        </w:rPr>
-        <w:t>trebuie</w:t>
-      </w:r>
-      <w:proofErr w:type="spellEnd"/>
-      <w:r>
-        <w:rPr>
-          <w:rFonts w:cstheme="minorHAnsi"/>
-        </w:rPr>
-        <w:t xml:space="preserve"> </w:t>
-      </w:r>
-      <w:proofErr w:type="spellStart"/>
-      <w:r>
-        <w:rPr>
-          <w:rFonts w:cstheme="minorHAnsi"/>
-        </w:rPr>
-        <w:t>să</w:t>
-      </w:r>
-      <w:proofErr w:type="spellEnd"/>
-      <w:r>
-        <w:rPr>
-          <w:rFonts w:cstheme="minorHAnsi"/>
-        </w:rPr>
-        <w:t xml:space="preserve"> </w:t>
-      </w:r>
-      <w:proofErr w:type="spellStart"/>
-      <w:r>
-        <w:rPr>
-          <w:rFonts w:cstheme="minorHAnsi"/>
-        </w:rPr>
-        <w:t>calculeze</w:t>
-      </w:r>
-      <w:proofErr w:type="spellEnd"/>
-      <w:r>
-        <w:rPr>
-          <w:rFonts w:cstheme="minorHAnsi"/>
-        </w:rPr>
-        <w:t xml:space="preserve"> automat </w:t>
-      </w:r>
-      <w:proofErr w:type="spellStart"/>
-      <w:r>
-        <w:rPr>
-          <w:rFonts w:cstheme="minorHAnsi"/>
-        </w:rPr>
-        <w:t>conținutul</w:t>
-      </w:r>
-      <w:proofErr w:type="spellEnd"/>
-      <w:r>
-        <w:rPr>
-          <w:rFonts w:cstheme="minorHAnsi"/>
-        </w:rPr>
-        <w:t xml:space="preserve"> </w:t>
-      </w:r>
-      <w:proofErr w:type="spellStart"/>
-      <w:r>
-        <w:rPr>
-          <w:rFonts w:cstheme="minorHAnsi"/>
-        </w:rPr>
-        <w:t>unei</w:t>
-      </w:r>
-      <w:proofErr w:type="spellEnd"/>
-      <w:r>
-        <w:rPr>
-          <w:rFonts w:cstheme="minorHAnsi"/>
-        </w:rPr>
-        <w:t xml:space="preserve"> </w:t>
-      </w:r>
-      <w:proofErr w:type="spellStart"/>
-      <w:r>
-        <w:rPr>
-          <w:rFonts w:cstheme="minorHAnsi"/>
-        </w:rPr>
-        <w:t>comenzi</w:t>
-      </w:r>
-      <w:proofErr w:type="spellEnd"/>
-      <w:r>
-        <w:rPr>
-          <w:rFonts w:cstheme="minorHAnsi"/>
-        </w:rPr>
-        <w:t xml:space="preserve"> pe </w:t>
-      </w:r>
-      <w:proofErr w:type="spellStart"/>
-      <w:r>
-        <w:rPr>
-          <w:rFonts w:cstheme="minorHAnsi"/>
-        </w:rPr>
-        <w:t>baza</w:t>
-      </w:r>
-      <w:proofErr w:type="spellEnd"/>
-      <w:r>
-        <w:rPr>
-          <w:rFonts w:cstheme="minorHAnsi"/>
-        </w:rPr>
-        <w:t xml:space="preserve"> </w:t>
-      </w:r>
-      <w:proofErr w:type="spellStart"/>
-      <w:r>
-        <w:rPr>
-          <w:rFonts w:cstheme="minorHAnsi"/>
-        </w:rPr>
-        <w:t>rețetelor</w:t>
-      </w:r>
-      <w:proofErr w:type="spellEnd"/>
-      <w:r>
-        <w:rPr>
-          <w:rFonts w:cstheme="minorHAnsi"/>
-        </w:rPr>
-        <w:t xml:space="preserve"> </w:t>
-      </w:r>
-      <w:proofErr w:type="spellStart"/>
-      <w:r>
-        <w:rPr>
-          <w:rFonts w:cstheme="minorHAnsi"/>
-        </w:rPr>
-        <w:t>produselor</w:t>
-      </w:r>
-      <w:proofErr w:type="spellEnd"/>
-      <w:r>
-        <w:rPr>
-          <w:rFonts w:cstheme="minorHAnsi"/>
-        </w:rPr>
-        <w:t>.</w:t>
+          <w:lang w:val="ro-RO"/>
+        </w:rPr>
+      </w:pPr>
+      <w:r>
+        <w:rPr>
+          <w:rFonts w:cstheme="minorHAnsi"/>
+          <w:lang w:val="ro-RO"/>
+        </w:rPr>
+        <w:t>Aplicația trebuie să calculeze automat conținutul unei comenzi pe baza rețetelor produselor.</w:t>
       </w:r>
     </w:p>
     <w:p>
@@ -2709,111 +862,15 @@
         <w:jc w:val="both"/>
         <w:rPr>
           <w:rFonts w:cstheme="minorHAnsi"/>
-        </w:rPr>
-      </w:pPr>
-      <w:r>
-        <w:rPr>
-          <w:rFonts w:cstheme="minorHAnsi"/>
-        </w:rPr>
-        <w:t xml:space="preserve">la </w:t>
-      </w:r>
-      <w:proofErr w:type="spellStart"/>
-      <w:r>
-        <w:rPr>
-          <w:rFonts w:cstheme="minorHAnsi"/>
-        </w:rPr>
-        <w:t>finalizarea</w:t>
-      </w:r>
-      <w:proofErr w:type="spellEnd"/>
-      <w:r>
-        <w:rPr>
-          <w:rFonts w:cstheme="minorHAnsi"/>
-        </w:rPr>
-        <w:t xml:space="preserve"> </w:t>
-      </w:r>
-      <w:proofErr w:type="spellStart"/>
-      <w:r>
-        <w:rPr>
-          <w:rFonts w:cstheme="minorHAnsi"/>
-        </w:rPr>
-        <w:t>comenzii</w:t>
-      </w:r>
-      <w:proofErr w:type="spellEnd"/>
-      <w:r>
-        <w:rPr>
-          <w:rFonts w:cstheme="minorHAnsi"/>
-        </w:rPr>
-        <w:t xml:space="preserve"> se </w:t>
-      </w:r>
-      <w:proofErr w:type="spellStart"/>
-      <w:r>
-        <w:rPr>
-          <w:rFonts w:cstheme="minorHAnsi"/>
-        </w:rPr>
-        <w:t>generează</w:t>
-      </w:r>
-      <w:proofErr w:type="spellEnd"/>
-      <w:r>
-        <w:rPr>
-          <w:rFonts w:cstheme="minorHAnsi"/>
-        </w:rPr>
-        <w:t xml:space="preserve"> </w:t>
-      </w:r>
-      <w:proofErr w:type="spellStart"/>
-      <w:r>
-        <w:rPr>
-          <w:rFonts w:cstheme="minorHAnsi"/>
-        </w:rPr>
-        <w:t>bonul</w:t>
-      </w:r>
-      <w:proofErr w:type="spellEnd"/>
-      <w:r>
-        <w:rPr>
-          <w:rFonts w:cstheme="minorHAnsi"/>
-        </w:rPr>
-        <w:t xml:space="preserve"> de </w:t>
-      </w:r>
-      <w:proofErr w:type="spellStart"/>
-      <w:r>
-        <w:rPr>
-          <w:rFonts w:cstheme="minorHAnsi"/>
-        </w:rPr>
-        <w:t>casă</w:t>
-      </w:r>
-      <w:proofErr w:type="spellEnd"/>
-      <w:r>
-        <w:rPr>
-          <w:rFonts w:cstheme="minorHAnsi"/>
-        </w:rPr>
-        <w:t xml:space="preserve"> care se </w:t>
-      </w:r>
-      <w:proofErr w:type="spellStart"/>
-      <w:r>
-        <w:rPr>
-          <w:rFonts w:cstheme="minorHAnsi"/>
-        </w:rPr>
-        <w:t>salvează</w:t>
-      </w:r>
-      <w:proofErr w:type="spellEnd"/>
-      <w:r>
-        <w:rPr>
-          <w:rFonts w:cstheme="minorHAnsi"/>
-        </w:rPr>
-        <w:t xml:space="preserve"> </w:t>
-      </w:r>
-      <w:proofErr w:type="spellStart"/>
-      <w:r>
-        <w:rPr>
-          <w:rFonts w:cstheme="minorHAnsi"/>
-        </w:rPr>
-        <w:t>în</w:t>
-      </w:r>
-      <w:proofErr w:type="spellEnd"/>
-      <w:r>
-        <w:rPr>
-          <w:rFonts w:cstheme="minorHAnsi"/>
-        </w:rPr>
-        <w:t xml:space="preserve"> format .csv.</w:t>
+          <w:lang w:val="ro-RO"/>
+        </w:rPr>
+      </w:pPr>
+      <w:r>
+        <w:rPr>
+          <w:rFonts w:cstheme="minorHAnsi"/>
+          <w:lang w:val="ro-RO"/>
+        </w:rPr>
+        <w:t>la finalizarea comenzii se generează bonul de casă care se salvează în format .csv.</w:t>
       </w:r>
     </w:p>
     <w:p>
@@ -2831,223 +888,22 @@
         <w:jc w:val="both"/>
         <w:rPr>
           <w:rFonts w:cstheme="minorHAnsi"/>
-        </w:rPr>
-      </w:pPr>
-      <w:r>
-        <w:rPr>
-          <w:rFonts w:cstheme="minorHAnsi"/>
-        </w:rPr>
-        <w:t xml:space="preserve">La </w:t>
-      </w:r>
-      <w:proofErr w:type="spellStart"/>
-      <w:r>
-        <w:rPr>
-          <w:rFonts w:cstheme="minorHAnsi"/>
-        </w:rPr>
-        <w:t>finalul</w:t>
-      </w:r>
-      <w:proofErr w:type="spellEnd"/>
-      <w:r>
-        <w:rPr>
-          <w:rFonts w:cstheme="minorHAnsi"/>
-        </w:rPr>
-        <w:t xml:space="preserve"> </w:t>
-      </w:r>
-      <w:proofErr w:type="spellStart"/>
-      <w:r>
-        <w:rPr>
-          <w:rFonts w:cstheme="minorHAnsi"/>
-        </w:rPr>
-        <w:t>fiecărei</w:t>
-      </w:r>
-      <w:proofErr w:type="spellEnd"/>
-      <w:r>
-        <w:rPr>
-          <w:rFonts w:cstheme="minorHAnsi"/>
-        </w:rPr>
-        <w:t xml:space="preserve"> </w:t>
-      </w:r>
-      <w:proofErr w:type="spellStart"/>
-      <w:r>
-        <w:rPr>
-          <w:rFonts w:cstheme="minorHAnsi"/>
-        </w:rPr>
-        <w:t>zile</w:t>
-      </w:r>
-      <w:proofErr w:type="spellEnd"/>
-      <w:r>
-        <w:rPr>
-          <w:rFonts w:cstheme="minorHAnsi"/>
-        </w:rPr>
-        <w:t xml:space="preserve"> se </w:t>
-      </w:r>
-      <w:proofErr w:type="spellStart"/>
-      <w:r>
-        <w:rPr>
-          <w:rFonts w:cstheme="minorHAnsi"/>
-        </w:rPr>
-        <w:t>salvează</w:t>
-      </w:r>
-      <w:proofErr w:type="spellEnd"/>
-      <w:r>
-        <w:rPr>
-          <w:rFonts w:cstheme="minorHAnsi"/>
-        </w:rPr>
-        <w:t xml:space="preserve"> </w:t>
-      </w:r>
-      <w:proofErr w:type="spellStart"/>
-      <w:r>
-        <w:rPr>
-          <w:rFonts w:cstheme="minorHAnsi"/>
-        </w:rPr>
-        <w:t>informațiile</w:t>
-      </w:r>
-      <w:proofErr w:type="spellEnd"/>
-      <w:r>
-        <w:rPr>
-          <w:rFonts w:cstheme="minorHAnsi"/>
-        </w:rPr>
-        <w:t xml:space="preserve"> </w:t>
-      </w:r>
-      <w:proofErr w:type="spellStart"/>
-      <w:r>
-        <w:rPr>
-          <w:rFonts w:cstheme="minorHAnsi"/>
-        </w:rPr>
-        <w:t>despre</w:t>
-      </w:r>
-      <w:proofErr w:type="spellEnd"/>
-      <w:r>
-        <w:rPr>
-          <w:rFonts w:cstheme="minorHAnsi"/>
-        </w:rPr>
-        <w:t xml:space="preserve"> </w:t>
-      </w:r>
-      <w:proofErr w:type="spellStart"/>
-      <w:r>
-        <w:rPr>
-          <w:rFonts w:cstheme="minorHAnsi"/>
-        </w:rPr>
-        <w:t>comenzile</w:t>
-      </w:r>
-      <w:proofErr w:type="spellEnd"/>
-      <w:r>
-        <w:rPr>
-          <w:rFonts w:cstheme="minorHAnsi"/>
-        </w:rPr>
-        <w:t xml:space="preserve"> </w:t>
-      </w:r>
-      <w:proofErr w:type="spellStart"/>
-      <w:r>
-        <w:rPr>
-          <w:rFonts w:cstheme="minorHAnsi"/>
-        </w:rPr>
-        <w:t>înregsitrate</w:t>
-      </w:r>
-      <w:proofErr w:type="spellEnd"/>
-      <w:r>
-        <w:rPr>
-          <w:rFonts w:cstheme="minorHAnsi"/>
-        </w:rPr>
-        <w:t xml:space="preserve"> </w:t>
-      </w:r>
-      <w:proofErr w:type="spellStart"/>
-      <w:r>
-        <w:rPr>
-          <w:rFonts w:cstheme="minorHAnsi"/>
-        </w:rPr>
-        <w:t>și</w:t>
-      </w:r>
-      <w:proofErr w:type="spellEnd"/>
-      <w:r>
-        <w:rPr>
-          <w:rFonts w:cstheme="minorHAnsi"/>
-        </w:rPr>
-        <w:t xml:space="preserve"> se </w:t>
-      </w:r>
-      <w:proofErr w:type="spellStart"/>
-      <w:r>
-        <w:rPr>
-          <w:rFonts w:cstheme="minorHAnsi"/>
-        </w:rPr>
-        <w:t>calculează</w:t>
-      </w:r>
-      <w:proofErr w:type="spellEnd"/>
-      <w:r>
-        <w:rPr>
-          <w:rFonts w:cstheme="minorHAnsi"/>
-        </w:rPr>
-        <w:t xml:space="preserve"> </w:t>
-      </w:r>
-      <w:proofErr w:type="spellStart"/>
-      <w:r>
-        <w:rPr>
-          <w:rFonts w:cstheme="minorHAnsi"/>
-        </w:rPr>
-        <w:t>totaul</w:t>
-      </w:r>
-      <w:proofErr w:type="spellEnd"/>
-      <w:r>
-        <w:rPr>
-          <w:rFonts w:cstheme="minorHAnsi"/>
-        </w:rPr>
-        <w:t xml:space="preserve"> </w:t>
-      </w:r>
-      <w:proofErr w:type="spellStart"/>
-      <w:r>
-        <w:rPr>
-          <w:rFonts w:cstheme="minorHAnsi"/>
-        </w:rPr>
-        <w:t>zilei</w:t>
-      </w:r>
-      <w:proofErr w:type="spellEnd"/>
-      <w:r>
-        <w:rPr>
-          <w:rFonts w:cstheme="minorHAnsi"/>
-        </w:rPr>
-        <w:t xml:space="preserve">. </w:t>
-      </w:r>
-      <w:proofErr w:type="spellStart"/>
-      <w:r>
-        <w:rPr>
-          <w:rFonts w:cstheme="minorHAnsi"/>
-        </w:rPr>
-        <w:t>Datele</w:t>
-      </w:r>
-      <w:proofErr w:type="spellEnd"/>
-      <w:r>
-        <w:rPr>
-          <w:rFonts w:cstheme="minorHAnsi"/>
-        </w:rPr>
-        <w:t xml:space="preserve"> pot fi </w:t>
-      </w:r>
-      <w:proofErr w:type="spellStart"/>
-      <w:r>
-        <w:rPr>
-          <w:rFonts w:cstheme="minorHAnsi"/>
-        </w:rPr>
-        <w:t>exportate</w:t>
-      </w:r>
-      <w:proofErr w:type="spellEnd"/>
-      <w:r>
-        <w:rPr>
-          <w:rFonts w:cstheme="minorHAnsi"/>
-        </w:rPr>
-        <w:t xml:space="preserve"> </w:t>
-      </w:r>
-      <w:proofErr w:type="spellStart"/>
-      <w:r>
-        <w:rPr>
-          <w:rFonts w:cstheme="minorHAnsi"/>
-        </w:rPr>
-        <w:t>în</w:t>
-      </w:r>
-      <w:proofErr w:type="spellEnd"/>
-      <w:r>
-        <w:rPr>
-          <w:rFonts w:cstheme="minorHAnsi"/>
-        </w:rPr>
-        <w:t xml:space="preserve"> format CSV.</w:t>
+          <w:lang w:val="ro-RO"/>
+        </w:rPr>
+      </w:pPr>
+      <w:r>
+        <w:rPr>
+          <w:rFonts w:cstheme="minorHAnsi"/>
+          <w:lang w:val="ro-RO"/>
+        </w:rPr>
+        <w:t xml:space="preserve">La finalul fiecărei zile se salvează informațiile despre comenzile înregsitrate și se calculează totaul zilei. </w:t>
+      </w:r>
+      <w:r>
+        <w:rPr>
+          <w:rFonts w:cstheme="minorHAnsi"/>
+          <w:lang w:val="ro-RO"/>
+        </w:rPr>
+        <w:t>Datele pot fi exportate în format CSV.</w:t>
       </w:r>
     </w:p>
     <w:p>
@@ -3061,14 +917,16 @@
         <w:jc w:val="both"/>
         <w:rPr>
           <w:rFonts w:cstheme="minorHAnsi"/>
-        </w:rPr>
-      </w:pPr>
-      <w:r>
-        <w:rPr>
-          <w:rFonts w:cstheme="minorHAnsi"/>
+          <w:lang w:val="ro-RO"/>
+        </w:rPr>
+      </w:pPr>
+      <w:r>
+        <w:rPr>
+          <w:rFonts w:cstheme="minorHAnsi"/>
+          <w:lang w:val="ro-RO"/>
         </w:rPr>
         <w:pict w14:anchorId="43BAC44F">
-          <v:rect id="_x0000_i1038" style="width:0;height:1.5pt" o:hralign="center" o:hrstd="t" o:hr="t" fillcolor="#a0a0a0" stroked="f"/>
+          <v:rect id="_x0000_i1025" style="width:0;height:1.5pt" o:hralign="center" o:hrstd="t" o:hr="t" fillcolor="#a0a0a0" stroked="f"/>
         </w:pict>
       </w:r>
     </w:p>
@@ -3085,51 +943,17 @@
           <w:rFonts w:cstheme="minorHAnsi"/>
           <w:b/>
           <w:bCs/>
-        </w:rPr>
-      </w:pPr>
-      <w:proofErr w:type="spellStart"/>
+          <w:lang w:val="ro-RO"/>
+        </w:rPr>
+      </w:pPr>
       <w:r>
         <w:rPr>
           <w:rFonts w:cstheme="minorHAnsi"/>
           <w:b/>
           <w:bCs/>
-        </w:rPr>
-        <w:t>Cerințe</w:t>
-      </w:r>
-      <w:proofErr w:type="spellEnd"/>
-      <w:r>
-        <w:rPr>
-          <w:rFonts w:cstheme="minorHAnsi"/>
-          <w:b/>
-          <w:bCs/>
-        </w:rPr>
-        <w:t xml:space="preserve"> n</w:t>
-      </w:r>
-      <w:r>
-        <w:rPr>
-          <w:rFonts w:cstheme="minorHAnsi"/>
-          <w:b/>
-          <w:bCs/>
-        </w:rPr>
-        <w:t>on-</w:t>
-      </w:r>
-      <w:proofErr w:type="spellStart"/>
-      <w:r>
-        <w:rPr>
-          <w:rFonts w:cstheme="minorHAnsi"/>
-          <w:b/>
-          <w:bCs/>
-        </w:rPr>
-        <w:t>funcționale</w:t>
-      </w:r>
-      <w:proofErr w:type="spellEnd"/>
-      <w:r>
-        <w:rPr>
-          <w:rFonts w:cstheme="minorHAnsi"/>
-          <w:b/>
-          <w:bCs/>
-        </w:rPr>
-        <w:t xml:space="preserve"> </w:t>
+          <w:lang w:val="ro-RO"/>
+        </w:rPr>
+        <w:t xml:space="preserve">Cerințe non-funcționale </w:t>
       </w:r>
     </w:p>
     <w:p>
@@ -3147,71 +971,29 @@
         <w:jc w:val="both"/>
         <w:rPr>
           <w:rFonts w:cstheme="minorHAnsi"/>
-        </w:rPr>
-      </w:pPr>
-      <w:proofErr w:type="spellStart"/>
-      <w:r>
-        <w:rPr>
-          <w:rFonts w:cstheme="minorHAnsi"/>
-        </w:rPr>
-        <w:t>Aplicația</w:t>
-      </w:r>
-      <w:proofErr w:type="spellEnd"/>
-      <w:r>
-        <w:rPr>
-          <w:rFonts w:cstheme="minorHAnsi"/>
-        </w:rPr>
-        <w:t xml:space="preserve"> </w:t>
-      </w:r>
-      <w:proofErr w:type="spellStart"/>
-      <w:r>
-        <w:rPr>
-          <w:rFonts w:cstheme="minorHAnsi"/>
-        </w:rPr>
-        <w:t>trebuie</w:t>
-      </w:r>
-      <w:proofErr w:type="spellEnd"/>
-      <w:r>
-        <w:rPr>
-          <w:rFonts w:cstheme="minorHAnsi"/>
-        </w:rPr>
-        <w:t xml:space="preserve"> </w:t>
-      </w:r>
-      <w:proofErr w:type="spellStart"/>
-      <w:r>
-        <w:rPr>
-          <w:rFonts w:cstheme="minorHAnsi"/>
-        </w:rPr>
-        <w:t>să</w:t>
-      </w:r>
-      <w:proofErr w:type="spellEnd"/>
-      <w:r>
-        <w:rPr>
-          <w:rFonts w:cstheme="minorHAnsi"/>
-        </w:rPr>
-        <w:t xml:space="preserve"> fie o </w:t>
-      </w:r>
-      <w:proofErr w:type="spellStart"/>
+          <w:lang w:val="ro-RO"/>
+        </w:rPr>
+      </w:pPr>
+      <w:r>
+        <w:rPr>
+          <w:rFonts w:cstheme="minorHAnsi"/>
+          <w:lang w:val="ro-RO"/>
+        </w:rPr>
+        <w:t xml:space="preserve">Aplicația trebuie să fie o </w:t>
+      </w:r>
       <w:r>
         <w:rPr>
           <w:rFonts w:cstheme="minorHAnsi"/>
           <w:b/>
           <w:bCs/>
-        </w:rPr>
-        <w:t>aplicație</w:t>
-      </w:r>
-      <w:proofErr w:type="spellEnd"/>
-      <w:r>
-        <w:rPr>
-          <w:rFonts w:cstheme="minorHAnsi"/>
-          <w:b/>
-          <w:bCs/>
-        </w:rPr>
-        <w:t xml:space="preserve"> desktop Java</w:t>
-      </w:r>
-      <w:r>
-        <w:rPr>
-          <w:rFonts w:cstheme="minorHAnsi"/>
+          <w:lang w:val="ro-RO"/>
+        </w:rPr>
+        <w:t>aplicație desktop Java</w:t>
+      </w:r>
+      <w:r>
+        <w:rPr>
+          <w:rFonts w:cstheme="minorHAnsi"/>
+          <w:lang w:val="ro-RO"/>
         </w:rPr>
         <w:t>.</w:t>
       </w:r>
@@ -3231,89 +1013,29 @@
         <w:jc w:val="both"/>
         <w:rPr>
           <w:rFonts w:cstheme="minorHAnsi"/>
-        </w:rPr>
-      </w:pPr>
-      <w:proofErr w:type="spellStart"/>
-      <w:r>
-        <w:rPr>
-          <w:rFonts w:cstheme="minorHAnsi"/>
-        </w:rPr>
-        <w:t>Interfața</w:t>
-      </w:r>
-      <w:proofErr w:type="spellEnd"/>
-      <w:r>
-        <w:rPr>
-          <w:rFonts w:cstheme="minorHAnsi"/>
-        </w:rPr>
-        <w:t xml:space="preserve"> </w:t>
-      </w:r>
-      <w:proofErr w:type="spellStart"/>
-      <w:r>
-        <w:rPr>
-          <w:rFonts w:cstheme="minorHAnsi"/>
-        </w:rPr>
-        <w:t>grafică</w:t>
-      </w:r>
-      <w:proofErr w:type="spellEnd"/>
-      <w:r>
-        <w:rPr>
-          <w:rFonts w:cstheme="minorHAnsi"/>
-        </w:rPr>
-        <w:t xml:space="preserve"> </w:t>
-      </w:r>
-      <w:proofErr w:type="spellStart"/>
-      <w:r>
-        <w:rPr>
-          <w:rFonts w:cstheme="minorHAnsi"/>
-        </w:rPr>
-        <w:t>trebuie</w:t>
-      </w:r>
-      <w:proofErr w:type="spellEnd"/>
-      <w:r>
-        <w:rPr>
-          <w:rFonts w:cstheme="minorHAnsi"/>
-        </w:rPr>
-        <w:t xml:space="preserve"> </w:t>
-      </w:r>
-      <w:proofErr w:type="spellStart"/>
-      <w:r>
-        <w:rPr>
-          <w:rFonts w:cstheme="minorHAnsi"/>
-        </w:rPr>
-        <w:t>realizată</w:t>
-      </w:r>
-      <w:proofErr w:type="spellEnd"/>
-      <w:r>
-        <w:rPr>
-          <w:rFonts w:cstheme="minorHAnsi"/>
-        </w:rPr>
-        <w:t xml:space="preserve"> </w:t>
-      </w:r>
-      <w:proofErr w:type="spellStart"/>
-      <w:r>
-        <w:rPr>
-          <w:rFonts w:cstheme="minorHAnsi"/>
-        </w:rPr>
-        <w:t>folosind</w:t>
-      </w:r>
-      <w:proofErr w:type="spellEnd"/>
-      <w:r>
-        <w:rPr>
-          <w:rFonts w:cstheme="minorHAnsi"/>
-        </w:rPr>
-        <w:t xml:space="preserve"> </w:t>
+          <w:lang w:val="ro-RO"/>
+        </w:rPr>
+      </w:pPr>
+      <w:r>
+        <w:rPr>
+          <w:rFonts w:cstheme="minorHAnsi"/>
+          <w:lang w:val="ro-RO"/>
+        </w:rPr>
+        <w:t xml:space="preserve">Interfața grafică trebuie realizată folosind </w:t>
       </w:r>
       <w:r>
         <w:rPr>
           <w:rFonts w:cstheme="minorHAnsi"/>
           <w:b/>
           <w:bCs/>
+          <w:lang w:val="ro-RO"/>
         </w:rPr>
         <w:t>JavaFX</w:t>
       </w:r>
       <w:r>
         <w:rPr>
           <w:rFonts w:cstheme="minorHAnsi"/>
+          <w:lang w:val="ro-RO"/>
         </w:rPr>
         <w:t>.</w:t>
       </w:r>
@@ -3333,99 +1055,29 @@
         <w:jc w:val="both"/>
         <w:rPr>
           <w:rFonts w:cstheme="minorHAnsi"/>
-        </w:rPr>
-      </w:pPr>
-      <w:proofErr w:type="spellStart"/>
-      <w:r>
-        <w:rPr>
-          <w:rFonts w:cstheme="minorHAnsi"/>
-        </w:rPr>
-        <w:t>Persistența</w:t>
-      </w:r>
-      <w:proofErr w:type="spellEnd"/>
-      <w:r>
-        <w:rPr>
-          <w:rFonts w:cstheme="minorHAnsi"/>
-        </w:rPr>
-        <w:t xml:space="preserve"> </w:t>
-      </w:r>
-      <w:proofErr w:type="spellStart"/>
-      <w:r>
-        <w:rPr>
-          <w:rFonts w:cstheme="minorHAnsi"/>
-        </w:rPr>
-        <w:t>datelor</w:t>
-      </w:r>
-      <w:proofErr w:type="spellEnd"/>
-      <w:r>
-        <w:rPr>
-          <w:rFonts w:cstheme="minorHAnsi"/>
-        </w:rPr>
-        <w:t xml:space="preserve"> </w:t>
-      </w:r>
-      <w:proofErr w:type="spellStart"/>
-      <w:r>
-        <w:rPr>
-          <w:rFonts w:cstheme="minorHAnsi"/>
-        </w:rPr>
-        <w:t>trebuie</w:t>
-      </w:r>
-      <w:proofErr w:type="spellEnd"/>
-      <w:r>
-        <w:rPr>
-          <w:rFonts w:cstheme="minorHAnsi"/>
-        </w:rPr>
-        <w:t xml:space="preserve"> </w:t>
-      </w:r>
-      <w:proofErr w:type="spellStart"/>
-      <w:r>
-        <w:rPr>
-          <w:rFonts w:cstheme="minorHAnsi"/>
-        </w:rPr>
-        <w:t>realizată</w:t>
-      </w:r>
-      <w:proofErr w:type="spellEnd"/>
-      <w:r>
-        <w:rPr>
-          <w:rFonts w:cstheme="minorHAnsi"/>
-        </w:rPr>
-        <w:t xml:space="preserve"> </w:t>
-      </w:r>
-      <w:proofErr w:type="spellStart"/>
-      <w:r>
-        <w:rPr>
-          <w:rFonts w:cstheme="minorHAnsi"/>
-        </w:rPr>
-        <w:t>în</w:t>
-      </w:r>
-      <w:proofErr w:type="spellEnd"/>
-      <w:r>
-        <w:rPr>
-          <w:rFonts w:cstheme="minorHAnsi"/>
-        </w:rPr>
-        <w:t xml:space="preserve"> </w:t>
-      </w:r>
-      <w:proofErr w:type="spellStart"/>
+          <w:lang w:val="ro-RO"/>
+        </w:rPr>
+      </w:pPr>
+      <w:r>
+        <w:rPr>
+          <w:rFonts w:cstheme="minorHAnsi"/>
+          <w:lang w:val="ro-RO"/>
+        </w:rPr>
+        <w:t xml:space="preserve">Persistența datelor trebuie realizată în </w:t>
+      </w:r>
       <w:r>
         <w:rPr>
           <w:rFonts w:cstheme="minorHAnsi"/>
           <w:b/>
           <w:bCs/>
-        </w:rPr>
-        <w:t>fișiere</w:t>
-      </w:r>
-      <w:proofErr w:type="spellEnd"/>
-      <w:r>
-        <w:rPr>
-          <w:rFonts w:cstheme="minorHAnsi"/>
-          <w:b/>
-          <w:bCs/>
-        </w:rPr>
-        <w:t xml:space="preserve"> text</w:t>
-      </w:r>
-      <w:r>
-        <w:rPr>
-          <w:rFonts w:cstheme="minorHAnsi"/>
+          <w:lang w:val="ro-RO"/>
+        </w:rPr>
+        <w:t>fișiere text</w:t>
+      </w:r>
+      <w:r>
+        <w:rPr>
+          <w:rFonts w:cstheme="minorHAnsi"/>
+          <w:lang w:val="ro-RO"/>
         </w:rPr>
         <w:t>.</w:t>
       </w:r>
@@ -3445,75 +1097,29 @@
         <w:jc w:val="both"/>
         <w:rPr>
           <w:rFonts w:cstheme="minorHAnsi"/>
-        </w:rPr>
-      </w:pPr>
-      <w:proofErr w:type="spellStart"/>
-      <w:r>
-        <w:rPr>
-          <w:rFonts w:cstheme="minorHAnsi"/>
-        </w:rPr>
-        <w:t>Accesul</w:t>
-      </w:r>
-      <w:proofErr w:type="spellEnd"/>
-      <w:r>
-        <w:rPr>
-          <w:rFonts w:cstheme="minorHAnsi"/>
-        </w:rPr>
-        <w:t xml:space="preserve"> la date </w:t>
-      </w:r>
-      <w:proofErr w:type="spellStart"/>
-      <w:r>
-        <w:rPr>
-          <w:rFonts w:cstheme="minorHAnsi"/>
-        </w:rPr>
-        <w:t>trebuie</w:t>
-      </w:r>
-      <w:proofErr w:type="spellEnd"/>
-      <w:r>
-        <w:rPr>
-          <w:rFonts w:cstheme="minorHAnsi"/>
-        </w:rPr>
-        <w:t xml:space="preserve"> </w:t>
-      </w:r>
-      <w:proofErr w:type="spellStart"/>
-      <w:r>
-        <w:rPr>
-          <w:rFonts w:cstheme="minorHAnsi"/>
-        </w:rPr>
-        <w:t>implementat</w:t>
-      </w:r>
-      <w:proofErr w:type="spellEnd"/>
-      <w:r>
-        <w:rPr>
-          <w:rFonts w:cstheme="minorHAnsi"/>
-        </w:rPr>
-        <w:t xml:space="preserve"> </w:t>
-      </w:r>
-      <w:proofErr w:type="spellStart"/>
-      <w:r>
-        <w:rPr>
-          <w:rFonts w:cstheme="minorHAnsi"/>
-        </w:rPr>
-        <w:t>folosind</w:t>
-      </w:r>
-      <w:proofErr w:type="spellEnd"/>
-      <w:r>
-        <w:rPr>
-          <w:rFonts w:cstheme="minorHAnsi"/>
-        </w:rPr>
-        <w:t xml:space="preserve"> </w:t>
+          <w:lang w:val="ro-RO"/>
+        </w:rPr>
+      </w:pPr>
+      <w:r>
+        <w:rPr>
+          <w:rFonts w:cstheme="minorHAnsi"/>
+          <w:lang w:val="ro-RO"/>
+        </w:rPr>
+        <w:t xml:space="preserve">Accesul la date trebuie implementat folosind </w:t>
       </w:r>
       <w:r>
         <w:rPr>
           <w:rFonts w:cstheme="minorHAnsi"/>
           <w:b/>
           <w:bCs/>
+          <w:lang w:val="ro-RO"/>
         </w:rPr>
         <w:t>Repository Pattern</w:t>
       </w:r>
       <w:r>
         <w:rPr>
           <w:rFonts w:cstheme="minorHAnsi"/>
+          <w:lang w:val="ro-RO"/>
         </w:rPr>
         <w:t>.</w:t>
       </w:r>
@@ -3533,83 +1139,15 @@
         <w:jc w:val="both"/>
         <w:rPr>
           <w:rFonts w:cstheme="minorHAnsi"/>
-        </w:rPr>
-      </w:pPr>
-      <w:r>
-        <w:rPr>
-          <w:rFonts w:cstheme="minorHAnsi"/>
-        </w:rPr>
-        <w:t xml:space="preserve">Logica </w:t>
-      </w:r>
-      <w:proofErr w:type="spellStart"/>
-      <w:r>
-        <w:rPr>
-          <w:rFonts w:cstheme="minorHAnsi"/>
-        </w:rPr>
-        <w:t>aplicației</w:t>
-      </w:r>
-      <w:proofErr w:type="spellEnd"/>
-      <w:r>
-        <w:rPr>
-          <w:rFonts w:cstheme="minorHAnsi"/>
-        </w:rPr>
-        <w:t xml:space="preserve"> </w:t>
-      </w:r>
-      <w:proofErr w:type="spellStart"/>
-      <w:r>
-        <w:rPr>
-          <w:rFonts w:cstheme="minorHAnsi"/>
-        </w:rPr>
-        <w:t>trebuie</w:t>
-      </w:r>
-      <w:proofErr w:type="spellEnd"/>
-      <w:r>
-        <w:rPr>
-          <w:rFonts w:cstheme="minorHAnsi"/>
-        </w:rPr>
-        <w:t xml:space="preserve"> </w:t>
-      </w:r>
-      <w:proofErr w:type="spellStart"/>
-      <w:r>
-        <w:rPr>
-          <w:rFonts w:cstheme="minorHAnsi"/>
-        </w:rPr>
-        <w:t>separată</w:t>
-      </w:r>
-      <w:proofErr w:type="spellEnd"/>
-      <w:r>
-        <w:rPr>
-          <w:rFonts w:cstheme="minorHAnsi"/>
-        </w:rPr>
-        <w:t xml:space="preserve"> de </w:t>
-      </w:r>
-      <w:proofErr w:type="spellStart"/>
-      <w:r>
-        <w:rPr>
-          <w:rFonts w:cstheme="minorHAnsi"/>
-        </w:rPr>
-        <w:t>interfața</w:t>
-      </w:r>
-      <w:proofErr w:type="spellEnd"/>
-      <w:r>
-        <w:rPr>
-          <w:rFonts w:cstheme="minorHAnsi"/>
-        </w:rPr>
-        <w:t xml:space="preserve"> </w:t>
-      </w:r>
-      <w:proofErr w:type="spellStart"/>
-      <w:r>
-        <w:rPr>
-          <w:rFonts w:cstheme="minorHAnsi"/>
-        </w:rPr>
-        <w:t>grafică</w:t>
-      </w:r>
-      <w:proofErr w:type="spellEnd"/>
-      <w:r>
-        <w:rPr>
-          <w:rFonts w:cstheme="minorHAnsi"/>
-        </w:rPr>
-        <w:t xml:space="preserve"> (layer Service).</w:t>
+          <w:lang w:val="ro-RO"/>
+        </w:rPr>
+      </w:pPr>
+      <w:r>
+        <w:rPr>
+          <w:rFonts w:cstheme="minorHAnsi"/>
+          <w:lang w:val="ro-RO"/>
+        </w:rPr>
+        <w:t>Logica aplicației trebuie separată de interfața grafică (layer Service).</w:t>
       </w:r>
     </w:p>
     <w:p>
@@ -3627,119 +1165,43 @@
         <w:jc w:val="both"/>
         <w:rPr>
           <w:rFonts w:cstheme="minorHAnsi"/>
-        </w:rPr>
-      </w:pPr>
-      <w:proofErr w:type="spellStart"/>
-      <w:r>
-        <w:rPr>
-          <w:rFonts w:cstheme="minorHAnsi"/>
-        </w:rPr>
-        <w:t>Codul</w:t>
-      </w:r>
-      <w:proofErr w:type="spellEnd"/>
-      <w:r>
-        <w:rPr>
-          <w:rFonts w:cstheme="minorHAnsi"/>
-        </w:rPr>
-        <w:t xml:space="preserve"> </w:t>
-      </w:r>
-      <w:proofErr w:type="spellStart"/>
-      <w:r>
-        <w:rPr>
-          <w:rFonts w:cstheme="minorHAnsi"/>
-        </w:rPr>
-        <w:t>trebuie</w:t>
-      </w:r>
-      <w:proofErr w:type="spellEnd"/>
-      <w:r>
-        <w:rPr>
-          <w:rFonts w:cstheme="minorHAnsi"/>
-        </w:rPr>
-        <w:t xml:space="preserve"> </w:t>
-      </w:r>
-      <w:proofErr w:type="spellStart"/>
-      <w:r>
-        <w:rPr>
-          <w:rFonts w:cstheme="minorHAnsi"/>
-        </w:rPr>
-        <w:t>să</w:t>
-      </w:r>
-      <w:proofErr w:type="spellEnd"/>
-      <w:r>
-        <w:rPr>
-          <w:rFonts w:cstheme="minorHAnsi"/>
-        </w:rPr>
-        <w:t xml:space="preserve"> </w:t>
-      </w:r>
-      <w:proofErr w:type="spellStart"/>
-      <w:r>
-        <w:rPr>
-          <w:rFonts w:cstheme="minorHAnsi"/>
-        </w:rPr>
-        <w:t>respecte</w:t>
-      </w:r>
-      <w:proofErr w:type="spellEnd"/>
-      <w:r>
-        <w:rPr>
-          <w:rFonts w:cstheme="minorHAnsi"/>
-        </w:rPr>
-        <w:t xml:space="preserve"> </w:t>
-      </w:r>
-      <w:proofErr w:type="spellStart"/>
-      <w:r>
-        <w:rPr>
-          <w:rFonts w:cstheme="minorHAnsi"/>
-        </w:rPr>
-        <w:t>principiile</w:t>
-      </w:r>
-      <w:proofErr w:type="spellEnd"/>
-      <w:r>
-        <w:rPr>
-          <w:rFonts w:cstheme="minorHAnsi"/>
-        </w:rPr>
-        <w:t xml:space="preserve"> OOP (</w:t>
-      </w:r>
-      <w:proofErr w:type="spellStart"/>
-      <w:r>
-        <w:rPr>
-          <w:rFonts w:cstheme="minorHAnsi"/>
-        </w:rPr>
-        <w:t>încapsulare</w:t>
-      </w:r>
-      <w:proofErr w:type="spellEnd"/>
-      <w:r>
-        <w:rPr>
-          <w:rFonts w:cstheme="minorHAnsi"/>
-        </w:rPr>
-        <w:t xml:space="preserve">, </w:t>
-      </w:r>
-      <w:proofErr w:type="spellStart"/>
-      <w:r>
-        <w:rPr>
-          <w:rFonts w:cstheme="minorHAnsi"/>
-        </w:rPr>
-        <w:t>separarea</w:t>
-      </w:r>
-      <w:proofErr w:type="spellEnd"/>
-      <w:r>
-        <w:rPr>
-          <w:rFonts w:cstheme="minorHAnsi"/>
-        </w:rPr>
-        <w:t xml:space="preserve"> </w:t>
-      </w:r>
-      <w:proofErr w:type="spellStart"/>
-      <w:r>
-        <w:rPr>
-          <w:rFonts w:cstheme="minorHAnsi"/>
-        </w:rPr>
-        <w:t>responsabilităților</w:t>
-      </w:r>
-      <w:proofErr w:type="spellEnd"/>
-      <w:r>
-        <w:rPr>
-          <w:rFonts w:cstheme="minorHAnsi"/>
-        </w:rPr>
-        <w:t>).</w:t>
+          <w:lang w:val="ro-RO"/>
+        </w:rPr>
+      </w:pPr>
+      <w:r>
+        <w:rPr>
+          <w:rFonts w:cstheme="minorHAnsi"/>
+          <w:lang w:val="ro-RO"/>
+        </w:rPr>
+        <w:t>Codul trebuie să respecte principiile OOP (încapsulare, separarea responsabilităților).</w:t>
+      </w:r>
+    </w:p>
+    <w:p>
+      <w:pPr>
+        <w:widowControl w:val="0"/>
+        <w:numPr>
+          <w:ilvl w:val="0"/>
+          <w:numId w:val="23"/>
+        </w:numPr>
+        <w:autoSpaceDE w:val="0"/>
+        <w:autoSpaceDN w:val="0"/>
+        <w:adjustRightInd w:val="0"/>
+        <w:spacing w:after="0" w:line="240" w:lineRule="auto"/>
+        <w:ind w:right="75"/>
+        <w:jc w:val="both"/>
+        <w:rPr>
+          <w:rFonts w:cstheme="minorHAnsi"/>
+          <w:lang w:val="ro-RO"/>
+        </w:rPr>
+      </w:pPr>
+      <w:r>
+        <w:rPr>
+          <w:rFonts w:cstheme="minorHAnsi"/>
+          <w:b/>
+          <w:bCs/>
+          <w:lang w:val="ro-RO"/>
+        </w:rPr>
+        <w:t>Aplicația este offline.</w:t>
       </w:r>
     </w:p>
     <w:sectPr>
@@ -3747,6 +1209,7 @@
       <w:footerReference w:type="default" r:id="rId9"/>
       <w:pgSz w:w="11907" w:h="16840" w:code="9"/>
       <w:pgMar w:top="1134" w:right="851" w:bottom="1134" w:left="851" w:header="680" w:footer="680" w:gutter="0"/>
+      <w:lnNumType w:countBy="1" w:restart="continuous"/>
       <w:cols w:space="720"/>
       <w:docGrid w:linePitch="360"/>
     </w:sectPr>
@@ -3875,7 +1338,6 @@
       </w:rPr>
       <w:t xml:space="preserve">Proiect </w:t>
     </w:r>
-    <w:proofErr w:type="spellStart"/>
     <w:r>
       <w:rPr>
         <w:rFonts w:cstheme="minorHAnsi"/>
@@ -3886,7 +1348,6 @@
       </w:rPr>
       <w:t>MyDrinkShop</w:t>
     </w:r>
-    <w:proofErr w:type="spellEnd"/>
     <w:r>
       <w:rPr>
         <w:rFonts w:cstheme="minorHAnsi"/>
@@ -3897,23 +1358,21 @@
       </w:rPr>
       <w:tab/>
     </w:r>
-    <w:proofErr w:type="spellStart"/>
     <w:r>
       <w:rPr>
         <w:rFonts w:cstheme="minorHAnsi"/>
         <w:sz w:val="24"/>
         <w:szCs w:val="24"/>
       </w:rPr>
-      <w:t>Informatică</w:t>
+      <w:t xml:space="preserve">Informatică </w:t>
     </w:r>
-    <w:proofErr w:type="spellEnd"/>
     <w:r>
       <w:rPr>
         <w:rFonts w:cstheme="minorHAnsi"/>
         <w:sz w:val="24"/>
         <w:szCs w:val="24"/>
       </w:rPr>
-      <w:t xml:space="preserve"> </w:t>
+      <w:t xml:space="preserve">– </w:t>
     </w:r>
     <w:r>
       <w:rPr>
@@ -3921,25 +1380,7 @@
         <w:sz w:val="24"/>
         <w:szCs w:val="24"/>
       </w:rPr>
-      <w:t xml:space="preserve">– </w:t>
-    </w:r>
-    <w:proofErr w:type="spellStart"/>
-    <w:r>
-      <w:rPr>
-        <w:rFonts w:cstheme="minorHAnsi"/>
-        <w:sz w:val="24"/>
-        <w:szCs w:val="24"/>
-      </w:rPr>
-      <w:t>Română</w:t>
-    </w:r>
-    <w:proofErr w:type="spellEnd"/>
-    <w:r>
-      <w:rPr>
-        <w:rFonts w:cstheme="minorHAnsi"/>
-        <w:sz w:val="24"/>
-        <w:szCs w:val="24"/>
-      </w:rPr>
-      <w:t>, 20</w:t>
+      <w:t>Română, 20</w:t>
     </w:r>
     <w:r>
       <w:rPr>
@@ -6929,6 +4370,7 @@
   <w:style w:type="character" w:default="1" w:styleId="DefaultParagraphFont">
     <w:name w:val="Default Paragraph Font"/>
     <w:uiPriority w:val="1"/>
+    <w:semiHidden/>
     <w:unhideWhenUsed/>
   </w:style>
   <w:style w:type="table" w:default="1" w:styleId="TableNormal">
@@ -7066,6 +4508,14 @@
         <w:insideV w:val="single" w:sz="4" w:space="0" w:color="auto"/>
       </w:tblBorders>
     </w:tblPr>
+  </w:style>
+  <w:style w:type="character" w:styleId="LineNumber">
+    <w:name w:val="line number"/>
+    <w:basedOn w:val="DefaultParagraphFont"/>
+    <w:uiPriority w:val="99"/>
+    <w:semiHidden/>
+    <w:unhideWhenUsed/>
+    <w:rsid w:val="00CF22D0"/>
   </w:style>
 </w:styles>
 </file>

</xml_diff>